<commit_message>
mise à jour données Naiades
</commit_message>
<xml_diff>
--- a/output/Bilan_Régional_Ecrevisses.docx
+++ b/output/Bilan_Régional_Ecrevisses.docx
@@ -31,7 +31,7 @@
         <w:pStyle w:val="Date"/>
       </w:pPr>
       <w:r>
-        <w:t xml:space="preserve">18 décembre 2025</w:t>
+        <w:t xml:space="preserve">05 janvier 2026</w:t>
       </w:r>
     </w:p>
     <w:sdt>
@@ -204,6 +204,27 @@
     </w:p>
     <w:p>
       <w:pPr>
+        <w:numPr>
+          <w:ilvl w:val="0"/>
+          <w:numId w:val="1001"/>
+        </w:numPr>
+      </w:pPr>
+      <w:r>
+        <w:rPr>
+          <w:b/>
+          <w:bCs/>
+        </w:rPr>
+        <w:t xml:space="preserve">NAIADES</w:t>
+      </w:r>
+      <w:r>
+        <w:t xml:space="preserve"> </w:t>
+      </w:r>
+      <w:r>
+        <w:t xml:space="preserve">: portail regroupant les données sur la qualité des eaux de surface (hydrobiologie, physicochimie, hydromorphologie), recueillies par les agences de l’eau, les offices de l’eau et l’OFB.</w:t>
+      </w:r>
+    </w:p>
+    <w:p>
+      <w:pPr>
         <w:pStyle w:val="FirstParagraph"/>
       </w:pPr>
       <w:r>
@@ -242,7 +263,7 @@
         <w:t xml:space="preserve">24 lignes de saisies</w:t>
       </w:r>
       <w:r>
-        <w:t xml:space="preserve">.</w:t>
+        <w:t xml:space="preserve">. Après vérification, il ne semble pas y avoir de doublons avec la base de données Naïades.</w:t>
       </w:r>
     </w:p>
     <w:tbl xmlns:w="http://schemas.openxmlformats.org/wordprocessingml/2006/main" xmlns:r="http://schemas.openxmlformats.org/officeDocument/2006/relationships" xmlns:w14="http://schemas.microsoft.com/office/word/2010/wordml" xmlns:wp="http://schemas.openxmlformats.org/drawingml/2006/wordprocessingDrawing" xmlns:a="http://schemas.openxmlformats.org/drawingml/2006/main" xmlns:pic="http://schemas.openxmlformats.org/drawingml/2006/picture">
@@ -763,9 +784,177 @@
       </w:tr>
       <w:tr>
         <w:trPr>
+          <w:trHeight w:val="574" w:hRule="auto"/>
+        </w:trPr>
+        body3
+        <w:tc>
+          <w:tcPr>
+            <w:tcBorders>
+              <w:bottom w:val="single" w:sz="6" w:space="0" w:color="666666"/>
+              <w:top w:val="single" w:sz="6" w:space="0" w:color="666666"/>
+              <w:left w:val="none" w:sz="0" w:space="0" w:color="000000"/>
+              <w:right w:val="none" w:sz="0" w:space="0" w:color="000000"/>
+            </w:tcBorders>
+            <w:shd w:val="clear" w:color="auto" w:fill="FFFFFF"/>
+            <w:tcMar>
+              <w:top w:w="0" w:type="dxa"/>
+              <w:bottom w:w="0" w:type="dxa"/>
+              <w:left w:w="0" w:type="dxa"/>
+              <w:right w:w="0" w:type="dxa"/>
+            </w:tcMar>
+            <w:vAlign w:val="center"/>
+          </w:tcPr>
+          <w:p>
+            <w:pPr>
+              <w:jc w:val="center"/>
+              <w:pBdr>
+                <w:bottom w:val="none" w:sz="0" w:space="0" w:color="000000"/>
+                <w:top w:val="none" w:sz="0" w:space="0" w:color="000000"/>
+                <w:left w:val="none" w:sz="0" w:space="0" w:color="000000"/>
+                <w:right w:val="none" w:sz="0" w:space="0" w:color="000000"/>
+              </w:pBdr>
+              <w:spacing w:after="100" w:before="100" w:line="240"/>
+              <w:ind w:left="100" w:right="100" w:firstLine="0" w:firstLineChars="0"/>
+              <w:rPr>
+                <w:rFonts w:ascii="Arial" w:hAnsi="Arial" w:eastAsia="Arial" w:cs="Arial"/>
+                <w:i w:val="false"/>
+                <w:b w:val="false"/>
+                <w:u w:val="none"/>
+                <w:strike w:val="false"/>
+                <w:sz w:val="22"/>
+                <w:szCs w:val="22"/>
+                <w:color w:val="000000"/>
+              </w:rPr>
+            </w:pPr>
+            <w:r xmlns:w="http://schemas.openxmlformats.org/wordprocessingml/2006/main" xmlns:wp="http://schemas.openxmlformats.org/drawingml/2006/wordprocessingDrawing" xmlns:r="http://schemas.openxmlformats.org/officeDocument/2006/relationships" xmlns:w14="http://schemas.microsoft.com/office/word/2010/wordml">
+              <w:rPr>
+                <w:rFonts w:ascii="Arial" w:hAnsi="Arial" w:eastAsia="Arial" w:cs="Arial"/>
+                <w:i w:val="false"/>
+                <w:b w:val="false"/>
+                <w:u w:val="none"/>
+                <w:strike w:val="false"/>
+                <w:sz w:val="22"/>
+                <w:szCs w:val="22"/>
+                <w:color w:val="000000"/>
+              </w:rPr>
+              <w:t xml:space="preserve">NAIADES</w:t>
+            </w:r>
+          </w:p>
+        </w:tc>
+        <w:tc>
+          <w:tcPr>
+            <w:tcBorders>
+              <w:bottom w:val="single" w:sz="6" w:space="0" w:color="666666"/>
+              <w:top w:val="single" w:sz="6" w:space="0" w:color="666666"/>
+              <w:left w:val="none" w:sz="0" w:space="0" w:color="000000"/>
+              <w:right w:val="none" w:sz="0" w:space="0" w:color="000000"/>
+            </w:tcBorders>
+            <w:shd w:val="clear" w:color="auto" w:fill="FFFFFF"/>
+            <w:tcMar>
+              <w:top w:w="0" w:type="dxa"/>
+              <w:bottom w:w="0" w:type="dxa"/>
+              <w:left w:w="0" w:type="dxa"/>
+              <w:right w:w="0" w:type="dxa"/>
+            </w:tcMar>
+            <w:vAlign w:val="center"/>
+          </w:tcPr>
+          <w:p>
+            <w:pPr>
+              <w:jc w:val="center"/>
+              <w:pBdr>
+                <w:bottom w:val="none" w:sz="0" w:space="0" w:color="000000"/>
+                <w:top w:val="none" w:sz="0" w:space="0" w:color="000000"/>
+                <w:left w:val="none" w:sz="0" w:space="0" w:color="000000"/>
+                <w:right w:val="none" w:sz="0" w:space="0" w:color="000000"/>
+              </w:pBdr>
+              <w:spacing w:after="100" w:before="100" w:line="240"/>
+              <w:ind w:left="100" w:right="100" w:firstLine="0" w:firstLineChars="0"/>
+              <w:rPr>
+                <w:rFonts w:ascii="Arial" w:hAnsi="Arial" w:eastAsia="Arial" w:cs="Arial"/>
+                <w:i w:val="false"/>
+                <w:b w:val="false"/>
+                <w:u w:val="none"/>
+                <w:strike w:val="false"/>
+                <w:sz w:val="22"/>
+                <w:szCs w:val="22"/>
+                <w:color w:val="000000"/>
+              </w:rPr>
+            </w:pPr>
+            <w:r xmlns:w="http://schemas.openxmlformats.org/wordprocessingml/2006/main" xmlns:wp="http://schemas.openxmlformats.org/drawingml/2006/wordprocessingDrawing" xmlns:r="http://schemas.openxmlformats.org/officeDocument/2006/relationships" xmlns:w14="http://schemas.microsoft.com/office/word/2010/wordml">
+              <w:rPr>
+                <w:rFonts w:ascii="Arial" w:hAnsi="Arial" w:eastAsia="Arial" w:cs="Arial"/>
+                <w:i w:val="false"/>
+                <w:b w:val="false"/>
+                <w:u w:val="none"/>
+                <w:strike w:val="false"/>
+                <w:sz w:val="22"/>
+                <w:szCs w:val="22"/>
+                <w:color w:val="000000"/>
+              </w:rPr>
+              <w:t xml:space="preserve">2 340</w:t>
+            </w:r>
+          </w:p>
+        </w:tc>
+        <w:tc>
+          <w:tcPr>
+            <w:tcBorders>
+              <w:bottom w:val="single" w:sz="6" w:space="0" w:color="666666"/>
+              <w:top w:val="single" w:sz="6" w:space="0" w:color="666666"/>
+              <w:left w:val="none" w:sz="0" w:space="0" w:color="000000"/>
+              <w:right w:val="none" w:sz="0" w:space="0" w:color="000000"/>
+            </w:tcBorders>
+            <w:shd w:val="clear" w:color="auto" w:fill="FFFFFF"/>
+            <w:tcMar>
+              <w:top w:w="0" w:type="dxa"/>
+              <w:bottom w:w="0" w:type="dxa"/>
+              <w:left w:w="0" w:type="dxa"/>
+              <w:right w:w="0" w:type="dxa"/>
+            </w:tcMar>
+            <w:vAlign w:val="center"/>
+          </w:tcPr>
+          <w:p>
+            <w:pPr>
+              <w:jc w:val="center"/>
+              <w:pBdr>
+                <w:bottom w:val="none" w:sz="0" w:space="0" w:color="000000"/>
+                <w:top w:val="none" w:sz="0" w:space="0" w:color="000000"/>
+                <w:left w:val="none" w:sz="0" w:space="0" w:color="000000"/>
+                <w:right w:val="none" w:sz="0" w:space="0" w:color="000000"/>
+              </w:pBdr>
+              <w:spacing w:after="100" w:before="100" w:line="240"/>
+              <w:ind w:left="100" w:right="100" w:firstLine="0" w:firstLineChars="0"/>
+              <w:rPr>
+                <w:rFonts w:ascii="Arial" w:hAnsi="Arial" w:eastAsia="Arial" w:cs="Arial"/>
+                <w:i w:val="false"/>
+                <w:b w:val="false"/>
+                <w:u w:val="none"/>
+                <w:strike w:val="false"/>
+                <w:sz w:val="22"/>
+                <w:szCs w:val="22"/>
+                <w:color w:val="000000"/>
+              </w:rPr>
+            </w:pPr>
+            <w:r xmlns:w="http://schemas.openxmlformats.org/wordprocessingml/2006/main" xmlns:wp="http://schemas.openxmlformats.org/drawingml/2006/wordprocessingDrawing" xmlns:r="http://schemas.openxmlformats.org/officeDocument/2006/relationships" xmlns:w14="http://schemas.microsoft.com/office/word/2010/wordml">
+              <w:rPr>
+                <w:rFonts w:ascii="Arial" w:hAnsi="Arial" w:eastAsia="Arial" w:cs="Arial"/>
+                <w:i w:val="false"/>
+                <w:b w:val="false"/>
+                <w:u w:val="none"/>
+                <w:strike w:val="false"/>
+                <w:sz w:val="22"/>
+                <w:szCs w:val="22"/>
+                <w:color w:val="000000"/>
+              </w:rPr>
+              <w:t xml:space="preserve">2 340</w:t>
+            </w:r>
+          </w:p>
+        </w:tc>
+      </w:tr>
+      <w:tr>
+        <w:trPr>
           <w:trHeight w:val="572" w:hRule="auto"/>
         </w:trPr>
-        body3
+        body4
         <w:tc>
           <w:tcPr>
             <w:tcBorders>
@@ -870,7 +1059,7 @@
                 <w:szCs w:val="22"/>
                 <w:color w:val="000000"/>
               </w:rPr>
-              <w:t xml:space="preserve">43 933</w:t>
+              <w:t xml:space="preserve">46 273</w:t>
             </w:r>
           </w:p>
         </w:tc>
@@ -924,7 +1113,7 @@
                 <w:szCs w:val="22"/>
                 <w:color w:val="000000"/>
               </w:rPr>
-              <w:t xml:space="preserve">43 909</w:t>
+              <w:t xml:space="preserve">46 248</w:t>
             </w:r>
           </w:p>
         </w:tc>
@@ -1306,7 +1495,7 @@
                 <w:szCs w:val="20"/>
                 <w:color w:val="000000"/>
               </w:rPr>
-              <w:t xml:space="preserve">1 808</w:t>
+              <w:t xml:space="preserve">1 869</w:t>
             </w:r>
           </w:p>
         </w:tc>
@@ -1360,7 +1549,7 @@
                 <w:szCs w:val="20"/>
                 <w:color w:val="000000"/>
               </w:rPr>
-              <w:t xml:space="preserve">49,211</w:t>
+              <w:t xml:space="preserve">48,382</w:t>
             </w:r>
           </w:p>
         </w:tc>
@@ -1474,7 +1663,7 @@
                 <w:szCs w:val="20"/>
                 <w:color w:val="000000"/>
               </w:rPr>
-              <w:t xml:space="preserve">823</w:t>
+              <w:t xml:space="preserve">893</w:t>
             </w:r>
           </w:p>
         </w:tc>
@@ -1528,7 +1717,7 @@
                 <w:szCs w:val="20"/>
                 <w:color w:val="000000"/>
               </w:rPr>
-              <w:t xml:space="preserve">22,401</w:t>
+              <w:t xml:space="preserve">23,117</w:t>
             </w:r>
           </w:p>
         </w:tc>
@@ -1642,7 +1831,7 @@
                 <w:szCs w:val="20"/>
                 <w:color w:val="000000"/>
               </w:rPr>
-              <w:t xml:space="preserve">656</w:t>
+              <w:t xml:space="preserve">714</w:t>
             </w:r>
           </w:p>
         </w:tc>
@@ -1696,7 +1885,7 @@
                 <w:szCs w:val="20"/>
                 <w:color w:val="000000"/>
               </w:rPr>
-              <w:t xml:space="preserve">17,855</w:t>
+              <w:t xml:space="preserve">18,483</w:t>
             </w:r>
           </w:p>
         </w:tc>
@@ -1864,7 +2053,7 @@
                 <w:szCs w:val="20"/>
                 <w:color w:val="000000"/>
               </w:rPr>
-              <w:t xml:space="preserve">10,343</w:t>
+              <w:t xml:space="preserve">9,837</w:t>
             </w:r>
           </w:p>
         </w:tc>
@@ -2032,7 +2221,7 @@
                 <w:szCs w:val="20"/>
                 <w:color w:val="000000"/>
               </w:rPr>
-              <w:t xml:space="preserve">0,191</w:t>
+              <w:t xml:space="preserve">0,181</w:t>
             </w:r>
           </w:p>
         </w:tc>
@@ -2053,7 +2242,7 @@
         <w:tblLook w:firstRow="1" w:lastRow="0" w:firstColumn="0" w:lastColumn="0" w:noHBand="0" w:noVBand="1"/>
       </w:tblPr>
       <w:tblGrid>
-        <w:gridCol w:w="2834"/>
+        <w:gridCol w:w="5045"/>
         <w:gridCol w:w="2355"/>
         <w:gridCol w:w="3405"/>
       </w:tblGrid>
@@ -2335,7 +2524,7 @@
                 <w:szCs w:val="20"/>
                 <w:color w:val="000000"/>
               </w:rPr>
-              <w:t xml:space="preserve">3 256</w:t>
+              <w:t xml:space="preserve">3 430</w:t>
             </w:r>
           </w:p>
         </w:tc>
@@ -2389,7 +2578,7 @@
                 <w:szCs w:val="20"/>
                 <w:color w:val="000000"/>
               </w:rPr>
-              <w:t xml:space="preserve">88,623</w:t>
+              <w:t xml:space="preserve">88,791</w:t>
             </w:r>
           </w:p>
         </w:tc>
@@ -2557,7 +2746,7 @@
                 <w:szCs w:val="20"/>
                 <w:color w:val="000000"/>
               </w:rPr>
-              <w:t xml:space="preserve">6,342</w:t>
+              <w:t xml:space="preserve">6,032</w:t>
             </w:r>
           </w:p>
         </w:tc>
@@ -2725,7 +2914,7 @@
                 <w:szCs w:val="20"/>
                 <w:color w:val="000000"/>
               </w:rPr>
-              <w:t xml:space="preserve">2,885</w:t>
+              <w:t xml:space="preserve">2,744</w:t>
             </w:r>
           </w:p>
         </w:tc>
@@ -2893,7 +3082,7 @@
                 <w:szCs w:val="20"/>
                 <w:color w:val="000000"/>
               </w:rPr>
-              <w:t xml:space="preserve">0,925</w:t>
+              <w:t xml:space="preserve">0,880</w:t>
             </w:r>
           </w:p>
         </w:tc>
@@ -3061,7 +3250,7 @@
                 <w:szCs w:val="20"/>
                 <w:color w:val="000000"/>
               </w:rPr>
-              <w:t xml:space="preserve">0,599</w:t>
+              <w:t xml:space="preserve">0,570</w:t>
             </w:r>
           </w:p>
         </w:tc>
@@ -3229,14 +3418,14 @@
                 <w:szCs w:val="20"/>
                 <w:color w:val="000000"/>
               </w:rPr>
-              <w:t xml:space="preserve">0,299</w:t>
+              <w:t xml:space="preserve">0,285</w:t>
             </w:r>
           </w:p>
         </w:tc>
       </w:tr>
       <w:tr>
         <w:trPr>
-          <w:trHeight w:val="598" w:hRule="auto"/>
+          <w:trHeight w:val="583" w:hRule="auto"/>
         </w:trPr>
         body 7
         <w:tc>
@@ -3289,7 +3478,7 @@
                 <w:szCs w:val="20"/>
                 <w:color w:val="000000"/>
               </w:rPr>
-              <w:t xml:space="preserve">RNN Prés Salés Arès Lège</w:t>
+              <w:t xml:space="preserve">AGENCE DE L'EAU LOIRE-BRETAGNE</w:t>
             </w:r>
           </w:p>
         </w:tc>
@@ -3343,7 +3532,7 @@
                 <w:szCs w:val="20"/>
                 <w:color w:val="000000"/>
               </w:rPr>
-              <w:t xml:space="preserve">4</w:t>
+              <w:t xml:space="preserve">10</w:t>
             </w:r>
           </w:p>
         </w:tc>
@@ -3397,7 +3586,7 @@
                 <w:szCs w:val="20"/>
                 <w:color w:val="000000"/>
               </w:rPr>
-              <w:t xml:space="preserve">0,109</w:t>
+              <w:t xml:space="preserve">0,259</w:t>
             </w:r>
           </w:p>
         </w:tc>
@@ -3457,7 +3646,7 @@
                 <w:szCs w:val="20"/>
                 <w:color w:val="000000"/>
               </w:rPr>
-              <w:t xml:space="preserve">FDAAPPMA 33</w:t>
+              <w:t xml:space="preserve">FEDERATION PECHE PISCICULTURE D-SEVRES</w:t>
             </w:r>
           </w:p>
         </w:tc>
@@ -3511,7 +3700,7 @@
                 <w:szCs w:val="20"/>
                 <w:color w:val="000000"/>
               </w:rPr>
-              <w:t xml:space="preserve">3</w:t>
+              <w:t xml:space="preserve">5</w:t>
             </w:r>
           </w:p>
         </w:tc>
@@ -3565,14 +3754,14 @@
                 <w:szCs w:val="20"/>
                 <w:color w:val="000000"/>
               </w:rPr>
-              <w:t xml:space="preserve">0,082</w:t>
+              <w:t xml:space="preserve">0,129</w:t>
             </w:r>
           </w:p>
         </w:tc>
       </w:tr>
       <w:tr>
         <w:trPr>
-          <w:trHeight w:val="583" w:hRule="auto"/>
+          <w:trHeight w:val="598" w:hRule="auto"/>
         </w:trPr>
         body 9
         <w:tc>
@@ -3625,7 +3814,7 @@
                 <w:szCs w:val="20"/>
                 <w:color w:val="000000"/>
               </w:rPr>
-              <w:t xml:space="preserve">CPIE Corrèze</w:t>
+              <w:t xml:space="preserve">RNN Prés Salés Arès Lège</w:t>
             </w:r>
           </w:p>
         </w:tc>
@@ -3679,7 +3868,7 @@
                 <w:szCs w:val="20"/>
                 <w:color w:val="000000"/>
               </w:rPr>
-              <w:t xml:space="preserve">2</w:t>
+              <w:t xml:space="preserve">4</w:t>
             </w:r>
           </w:p>
         </w:tc>
@@ -3733,7 +3922,7 @@
                 <w:szCs w:val="20"/>
                 <w:color w:val="000000"/>
               </w:rPr>
-              <w:t xml:space="preserve">0,054</w:t>
+              <w:t xml:space="preserve">0,104</w:t>
             </w:r>
           </w:p>
         </w:tc>
@@ -3793,7 +3982,7 @@
                 <w:szCs w:val="20"/>
                 <w:color w:val="000000"/>
               </w:rPr>
-              <w:t xml:space="preserve">CPIE 47</w:t>
+              <w:t xml:space="preserve">FDAAPPMA 33</w:t>
             </w:r>
           </w:p>
         </w:tc>
@@ -3847,7 +4036,7 @@
                 <w:szCs w:val="20"/>
                 <w:color w:val="000000"/>
               </w:rPr>
-              <w:t xml:space="preserve">1</w:t>
+              <w:t xml:space="preserve">3</w:t>
             </w:r>
           </w:p>
         </w:tc>
@@ -3901,7 +4090,7 @@
                 <w:szCs w:val="20"/>
                 <w:color w:val="000000"/>
               </w:rPr>
-              <w:t xml:space="preserve">0,027</w:t>
+              <w:t xml:space="preserve">0,078</w:t>
             </w:r>
           </w:p>
         </w:tc>
@@ -3961,7 +4150,7 @@
                 <w:szCs w:val="20"/>
                 <w:color w:val="000000"/>
               </w:rPr>
-              <w:t xml:space="preserve">Cistude Nature</w:t>
+              <w:t xml:space="preserve">CPIE Corrèze</w:t>
             </w:r>
           </w:p>
         </w:tc>
@@ -4015,7 +4204,7 @@
                 <w:szCs w:val="20"/>
                 <w:color w:val="000000"/>
               </w:rPr>
-              <w:t xml:space="preserve">1</w:t>
+              <w:t xml:space="preserve">2</w:t>
             </w:r>
           </w:p>
         </w:tc>
@@ -4069,7 +4258,7 @@
                 <w:szCs w:val="20"/>
                 <w:color w:val="000000"/>
               </w:rPr>
-              <w:t xml:space="preserve">0,027</w:t>
+              <w:t xml:space="preserve">0,052</w:t>
             </w:r>
           </w:p>
         </w:tc>
@@ -4082,6 +4271,342 @@
         <w:tc>
           <w:tcPr>
             <w:tcBorders>
+              <w:bottom w:val="single" w:sz="6" w:space="0" w:color="666666"/>
+              <w:top w:val="single" w:sz="6" w:space="0" w:color="666666"/>
+              <w:left w:val="none" w:sz="0" w:space="0" w:color="000000"/>
+              <w:right w:val="none" w:sz="0" w:space="0" w:color="000000"/>
+            </w:tcBorders>
+            <w:shd w:val="clear" w:color="auto" w:fill="FFFFFF"/>
+            <w:tcMar>
+              <w:top w:w="0" w:type="dxa"/>
+              <w:bottom w:w="0" w:type="dxa"/>
+              <w:left w:w="0" w:type="dxa"/>
+              <w:right w:w="0" w:type="dxa"/>
+            </w:tcMar>
+            <w:vAlign w:val="center"/>
+          </w:tcPr>
+          <w:p>
+            <w:pPr>
+              <w:jc w:val="center"/>
+              <w:pBdr>
+                <w:bottom w:val="none" w:sz="0" w:space="0" w:color="000000"/>
+                <w:top w:val="none" w:sz="0" w:space="0" w:color="000000"/>
+                <w:left w:val="none" w:sz="0" w:space="0" w:color="000000"/>
+                <w:right w:val="none" w:sz="0" w:space="0" w:color="000000"/>
+              </w:pBdr>
+              <w:spacing w:after="100" w:before="100" w:line="240"/>
+              <w:ind w:left="100" w:right="100" w:firstLine="0" w:firstLineChars="0"/>
+              <w:rPr>
+                <w:rFonts w:ascii="Arial" w:hAnsi="Arial" w:eastAsia="Arial" w:cs="Arial"/>
+                <w:i w:val="false"/>
+                <w:b w:val="false"/>
+                <w:u w:val="none"/>
+                <w:strike w:val="false"/>
+                <w:sz w:val="20"/>
+                <w:szCs w:val="20"/>
+                <w:color w:val="000000"/>
+              </w:rPr>
+            </w:pPr>
+            <w:r xmlns:w="http://schemas.openxmlformats.org/wordprocessingml/2006/main" xmlns:wp="http://schemas.openxmlformats.org/drawingml/2006/wordprocessingDrawing" xmlns:r="http://schemas.openxmlformats.org/officeDocument/2006/relationships" xmlns:w14="http://schemas.microsoft.com/office/word/2010/wordml">
+              <w:rPr>
+                <w:rFonts w:ascii="Arial" w:hAnsi="Arial" w:eastAsia="Arial" w:cs="Arial"/>
+                <w:i w:val="false"/>
+                <w:b w:val="false"/>
+                <w:u w:val="none"/>
+                <w:strike w:val="false"/>
+                <w:sz w:val="20"/>
+                <w:szCs w:val="20"/>
+                <w:color w:val="000000"/>
+              </w:rPr>
+              <w:t xml:space="preserve">CPIE 47</w:t>
+            </w:r>
+          </w:p>
+        </w:tc>
+        <w:tc>
+          <w:tcPr>
+            <w:tcBorders>
+              <w:bottom w:val="single" w:sz="6" w:space="0" w:color="666666"/>
+              <w:top w:val="single" w:sz="6" w:space="0" w:color="666666"/>
+              <w:left w:val="none" w:sz="0" w:space="0" w:color="000000"/>
+              <w:right w:val="none" w:sz="0" w:space="0" w:color="000000"/>
+            </w:tcBorders>
+            <w:shd w:val="clear" w:color="auto" w:fill="FFFFFF"/>
+            <w:tcMar>
+              <w:top w:w="0" w:type="dxa"/>
+              <w:bottom w:w="0" w:type="dxa"/>
+              <w:left w:w="0" w:type="dxa"/>
+              <w:right w:w="0" w:type="dxa"/>
+            </w:tcMar>
+            <w:vAlign w:val="center"/>
+          </w:tcPr>
+          <w:p>
+            <w:pPr>
+              <w:jc w:val="center"/>
+              <w:pBdr>
+                <w:bottom w:val="none" w:sz="0" w:space="0" w:color="000000"/>
+                <w:top w:val="none" w:sz="0" w:space="0" w:color="000000"/>
+                <w:left w:val="none" w:sz="0" w:space="0" w:color="000000"/>
+                <w:right w:val="none" w:sz="0" w:space="0" w:color="000000"/>
+              </w:pBdr>
+              <w:spacing w:after="100" w:before="100" w:line="240"/>
+              <w:ind w:left="100" w:right="100" w:firstLine="0" w:firstLineChars="0"/>
+              <w:rPr>
+                <w:rFonts w:ascii="Arial" w:hAnsi="Arial" w:eastAsia="Arial" w:cs="Arial"/>
+                <w:i w:val="false"/>
+                <w:b w:val="false"/>
+                <w:u w:val="none"/>
+                <w:strike w:val="false"/>
+                <w:sz w:val="20"/>
+                <w:szCs w:val="20"/>
+                <w:color w:val="000000"/>
+              </w:rPr>
+            </w:pPr>
+            <w:r xmlns:w="http://schemas.openxmlformats.org/wordprocessingml/2006/main" xmlns:wp="http://schemas.openxmlformats.org/drawingml/2006/wordprocessingDrawing" xmlns:r="http://schemas.openxmlformats.org/officeDocument/2006/relationships" xmlns:w14="http://schemas.microsoft.com/office/word/2010/wordml">
+              <w:rPr>
+                <w:rFonts w:ascii="Arial" w:hAnsi="Arial" w:eastAsia="Arial" w:cs="Arial"/>
+                <w:i w:val="false"/>
+                <w:b w:val="false"/>
+                <w:u w:val="none"/>
+                <w:strike w:val="false"/>
+                <w:sz w:val="20"/>
+                <w:szCs w:val="20"/>
+                <w:color w:val="000000"/>
+              </w:rPr>
+              <w:t xml:space="preserve">1</w:t>
+            </w:r>
+          </w:p>
+        </w:tc>
+        <w:tc>
+          <w:tcPr>
+            <w:tcBorders>
+              <w:bottom w:val="single" w:sz="6" w:space="0" w:color="666666"/>
+              <w:top w:val="single" w:sz="6" w:space="0" w:color="666666"/>
+              <w:left w:val="none" w:sz="0" w:space="0" w:color="000000"/>
+              <w:right w:val="none" w:sz="0" w:space="0" w:color="000000"/>
+            </w:tcBorders>
+            <w:shd w:val="clear" w:color="auto" w:fill="FFFFFF"/>
+            <w:tcMar>
+              <w:top w:w="0" w:type="dxa"/>
+              <w:bottom w:w="0" w:type="dxa"/>
+              <w:left w:w="0" w:type="dxa"/>
+              <w:right w:w="0" w:type="dxa"/>
+            </w:tcMar>
+            <w:vAlign w:val="center"/>
+          </w:tcPr>
+          <w:p>
+            <w:pPr>
+              <w:jc w:val="center"/>
+              <w:pBdr>
+                <w:bottom w:val="none" w:sz="0" w:space="0" w:color="000000"/>
+                <w:top w:val="none" w:sz="0" w:space="0" w:color="000000"/>
+                <w:left w:val="none" w:sz="0" w:space="0" w:color="000000"/>
+                <w:right w:val="none" w:sz="0" w:space="0" w:color="000000"/>
+              </w:pBdr>
+              <w:spacing w:after="100" w:before="100" w:line="240"/>
+              <w:ind w:left="100" w:right="100" w:firstLine="0" w:firstLineChars="0"/>
+              <w:rPr>
+                <w:rFonts w:ascii="Arial" w:hAnsi="Arial" w:eastAsia="Arial" w:cs="Arial"/>
+                <w:i w:val="false"/>
+                <w:b w:val="false"/>
+                <w:u w:val="none"/>
+                <w:strike w:val="false"/>
+                <w:sz w:val="20"/>
+                <w:szCs w:val="20"/>
+                <w:color w:val="000000"/>
+              </w:rPr>
+            </w:pPr>
+            <w:r xmlns:w="http://schemas.openxmlformats.org/wordprocessingml/2006/main" xmlns:wp="http://schemas.openxmlformats.org/drawingml/2006/wordprocessingDrawing" xmlns:r="http://schemas.openxmlformats.org/officeDocument/2006/relationships" xmlns:w14="http://schemas.microsoft.com/office/word/2010/wordml">
+              <w:rPr>
+                <w:rFonts w:ascii="Arial" w:hAnsi="Arial" w:eastAsia="Arial" w:cs="Arial"/>
+                <w:i w:val="false"/>
+                <w:b w:val="false"/>
+                <w:u w:val="none"/>
+                <w:strike w:val="false"/>
+                <w:sz w:val="20"/>
+                <w:szCs w:val="20"/>
+                <w:color w:val="000000"/>
+              </w:rPr>
+              <w:t xml:space="preserve">0,026</w:t>
+            </w:r>
+          </w:p>
+        </w:tc>
+      </w:tr>
+      <w:tr>
+        <w:trPr>
+          <w:trHeight w:val="583" w:hRule="auto"/>
+        </w:trPr>
+        body13
+        <w:tc>
+          <w:tcPr>
+            <w:tcBorders>
+              <w:bottom w:val="single" w:sz="6" w:space="0" w:color="666666"/>
+              <w:top w:val="single" w:sz="6" w:space="0" w:color="666666"/>
+              <w:left w:val="none" w:sz="0" w:space="0" w:color="000000"/>
+              <w:right w:val="none" w:sz="0" w:space="0" w:color="000000"/>
+            </w:tcBorders>
+            <w:shd w:val="clear" w:color="auto" w:fill="FFFFFF"/>
+            <w:tcMar>
+              <w:top w:w="0" w:type="dxa"/>
+              <w:bottom w:w="0" w:type="dxa"/>
+              <w:left w:w="0" w:type="dxa"/>
+              <w:right w:w="0" w:type="dxa"/>
+            </w:tcMar>
+            <w:vAlign w:val="center"/>
+          </w:tcPr>
+          <w:p>
+            <w:pPr>
+              <w:jc w:val="center"/>
+              <w:pBdr>
+                <w:bottom w:val="none" w:sz="0" w:space="0" w:color="000000"/>
+                <w:top w:val="none" w:sz="0" w:space="0" w:color="000000"/>
+                <w:left w:val="none" w:sz="0" w:space="0" w:color="000000"/>
+                <w:right w:val="none" w:sz="0" w:space="0" w:color="000000"/>
+              </w:pBdr>
+              <w:spacing w:after="100" w:before="100" w:line="240"/>
+              <w:ind w:left="100" w:right="100" w:firstLine="0" w:firstLineChars="0"/>
+              <w:rPr>
+                <w:rFonts w:ascii="Arial" w:hAnsi="Arial" w:eastAsia="Arial" w:cs="Arial"/>
+                <w:i w:val="false"/>
+                <w:b w:val="false"/>
+                <w:u w:val="none"/>
+                <w:strike w:val="false"/>
+                <w:sz w:val="20"/>
+                <w:szCs w:val="20"/>
+                <w:color w:val="000000"/>
+              </w:rPr>
+            </w:pPr>
+            <w:r xmlns:w="http://schemas.openxmlformats.org/wordprocessingml/2006/main" xmlns:wp="http://schemas.openxmlformats.org/drawingml/2006/wordprocessingDrawing" xmlns:r="http://schemas.openxmlformats.org/officeDocument/2006/relationships" xmlns:w14="http://schemas.microsoft.com/office/word/2010/wordml">
+              <w:rPr>
+                <w:rFonts w:ascii="Arial" w:hAnsi="Arial" w:eastAsia="Arial" w:cs="Arial"/>
+                <w:i w:val="false"/>
+                <w:b w:val="false"/>
+                <w:u w:val="none"/>
+                <w:strike w:val="false"/>
+                <w:sz w:val="20"/>
+                <w:szCs w:val="20"/>
+                <w:color w:val="000000"/>
+              </w:rPr>
+              <w:t xml:space="preserve">Cistude Nature</w:t>
+            </w:r>
+          </w:p>
+        </w:tc>
+        <w:tc>
+          <w:tcPr>
+            <w:tcBorders>
+              <w:bottom w:val="single" w:sz="6" w:space="0" w:color="666666"/>
+              <w:top w:val="single" w:sz="6" w:space="0" w:color="666666"/>
+              <w:left w:val="none" w:sz="0" w:space="0" w:color="000000"/>
+              <w:right w:val="none" w:sz="0" w:space="0" w:color="000000"/>
+            </w:tcBorders>
+            <w:shd w:val="clear" w:color="auto" w:fill="FFFFFF"/>
+            <w:tcMar>
+              <w:top w:w="0" w:type="dxa"/>
+              <w:bottom w:w="0" w:type="dxa"/>
+              <w:left w:w="0" w:type="dxa"/>
+              <w:right w:w="0" w:type="dxa"/>
+            </w:tcMar>
+            <w:vAlign w:val="center"/>
+          </w:tcPr>
+          <w:p>
+            <w:pPr>
+              <w:jc w:val="center"/>
+              <w:pBdr>
+                <w:bottom w:val="none" w:sz="0" w:space="0" w:color="000000"/>
+                <w:top w:val="none" w:sz="0" w:space="0" w:color="000000"/>
+                <w:left w:val="none" w:sz="0" w:space="0" w:color="000000"/>
+                <w:right w:val="none" w:sz="0" w:space="0" w:color="000000"/>
+              </w:pBdr>
+              <w:spacing w:after="100" w:before="100" w:line="240"/>
+              <w:ind w:left="100" w:right="100" w:firstLine="0" w:firstLineChars="0"/>
+              <w:rPr>
+                <w:rFonts w:ascii="Arial" w:hAnsi="Arial" w:eastAsia="Arial" w:cs="Arial"/>
+                <w:i w:val="false"/>
+                <w:b w:val="false"/>
+                <w:u w:val="none"/>
+                <w:strike w:val="false"/>
+                <w:sz w:val="20"/>
+                <w:szCs w:val="20"/>
+                <w:color w:val="000000"/>
+              </w:rPr>
+            </w:pPr>
+            <w:r xmlns:w="http://schemas.openxmlformats.org/wordprocessingml/2006/main" xmlns:wp="http://schemas.openxmlformats.org/drawingml/2006/wordprocessingDrawing" xmlns:r="http://schemas.openxmlformats.org/officeDocument/2006/relationships" xmlns:w14="http://schemas.microsoft.com/office/word/2010/wordml">
+              <w:rPr>
+                <w:rFonts w:ascii="Arial" w:hAnsi="Arial" w:eastAsia="Arial" w:cs="Arial"/>
+                <w:i w:val="false"/>
+                <w:b w:val="false"/>
+                <w:u w:val="none"/>
+                <w:strike w:val="false"/>
+                <w:sz w:val="20"/>
+                <w:szCs w:val="20"/>
+                <w:color w:val="000000"/>
+              </w:rPr>
+              <w:t xml:space="preserve">1</w:t>
+            </w:r>
+          </w:p>
+        </w:tc>
+        <w:tc>
+          <w:tcPr>
+            <w:tcBorders>
+              <w:bottom w:val="single" w:sz="6" w:space="0" w:color="666666"/>
+              <w:top w:val="single" w:sz="6" w:space="0" w:color="666666"/>
+              <w:left w:val="none" w:sz="0" w:space="0" w:color="000000"/>
+              <w:right w:val="none" w:sz="0" w:space="0" w:color="000000"/>
+            </w:tcBorders>
+            <w:shd w:val="clear" w:color="auto" w:fill="FFFFFF"/>
+            <w:tcMar>
+              <w:top w:w="0" w:type="dxa"/>
+              <w:bottom w:w="0" w:type="dxa"/>
+              <w:left w:w="0" w:type="dxa"/>
+              <w:right w:w="0" w:type="dxa"/>
+            </w:tcMar>
+            <w:vAlign w:val="center"/>
+          </w:tcPr>
+          <w:p>
+            <w:pPr>
+              <w:jc w:val="center"/>
+              <w:pBdr>
+                <w:bottom w:val="none" w:sz="0" w:space="0" w:color="000000"/>
+                <w:top w:val="none" w:sz="0" w:space="0" w:color="000000"/>
+                <w:left w:val="none" w:sz="0" w:space="0" w:color="000000"/>
+                <w:right w:val="none" w:sz="0" w:space="0" w:color="000000"/>
+              </w:pBdr>
+              <w:spacing w:after="100" w:before="100" w:line="240"/>
+              <w:ind w:left="100" w:right="100" w:firstLine="0" w:firstLineChars="0"/>
+              <w:rPr>
+                <w:rFonts w:ascii="Arial" w:hAnsi="Arial" w:eastAsia="Arial" w:cs="Arial"/>
+                <w:i w:val="false"/>
+                <w:b w:val="false"/>
+                <w:u w:val="none"/>
+                <w:strike w:val="false"/>
+                <w:sz w:val="20"/>
+                <w:szCs w:val="20"/>
+                <w:color w:val="000000"/>
+              </w:rPr>
+            </w:pPr>
+            <w:r xmlns:w="http://schemas.openxmlformats.org/wordprocessingml/2006/main" xmlns:wp="http://schemas.openxmlformats.org/drawingml/2006/wordprocessingDrawing" xmlns:r="http://schemas.openxmlformats.org/officeDocument/2006/relationships" xmlns:w14="http://schemas.microsoft.com/office/word/2010/wordml">
+              <w:rPr>
+                <w:rFonts w:ascii="Arial" w:hAnsi="Arial" w:eastAsia="Arial" w:cs="Arial"/>
+                <w:i w:val="false"/>
+                <w:b w:val="false"/>
+                <w:u w:val="none"/>
+                <w:strike w:val="false"/>
+                <w:sz w:val="20"/>
+                <w:szCs w:val="20"/>
+                <w:color w:val="000000"/>
+              </w:rPr>
+              <w:t xml:space="preserve">0,026</w:t>
+            </w:r>
+          </w:p>
+        </w:tc>
+      </w:tr>
+      <w:tr>
+        <w:trPr>
+          <w:trHeight w:val="583" w:hRule="auto"/>
+        </w:trPr>
+        body14
+        <w:tc>
+          <w:tcPr>
+            <w:tcBorders>
               <w:bottom w:val="single" w:sz="12" w:space="0" w:color="666666"/>
               <w:top w:val="single" w:sz="6" w:space="0" w:color="666666"/>
               <w:left w:val="none" w:sz="0" w:space="0" w:color="000000"/>
@@ -4237,7 +4762,7 @@
                 <w:szCs w:val="20"/>
                 <w:color w:val="000000"/>
               </w:rPr>
-              <w:t xml:space="preserve">0,027</w:t>
+              <w:t xml:space="preserve">0,026</w:t>
             </w:r>
           </w:p>
         </w:tc>
@@ -4280,7 +4805,7 @@
               <a:graphicData uri="http://schemas.openxmlformats.org/drawingml/2006/picture">
                 <pic:pic>
                   <pic:nvPicPr>
-                    <pic:cNvPr descr="../output/Bilan_Régional_Ecrevisses_files/figure-docx/unnamed-chunk-5-1.png" id="25" name="Picture"/>
+                    <pic:cNvPr descr="../output/Bilan_Régional_Ecrevisses_files/figure-docx/unnamed-chunk-4-1.png" id="25" name="Picture"/>
                     <pic:cNvPicPr>
                       <a:picLocks noChangeArrowheads="1" noChangeAspect="1"/>
                     </pic:cNvPicPr>
@@ -4327,7 +4852,7 @@
               <a:graphicData uri="http://schemas.openxmlformats.org/drawingml/2006/picture">
                 <pic:pic>
                   <pic:nvPicPr>
-                    <pic:cNvPr descr="../output/Bilan_Régional_Ecrevisses_files/figure-docx/unnamed-chunk-6-1.png" id="28" name="Picture"/>
+                    <pic:cNvPr descr="../output/Bilan_Régional_Ecrevisses_files/figure-docx/unnamed-chunk-5-1.png" id="28" name="Picture"/>
                     <pic:cNvPicPr>
                       <a:picLocks noChangeArrowheads="1" noChangeAspect="1"/>
                     </pic:cNvPicPr>
@@ -4397,7 +4922,7 @@
               <a:graphicData uri="http://schemas.openxmlformats.org/drawingml/2006/picture">
                 <pic:pic>
                   <pic:nvPicPr>
-                    <pic:cNvPr descr="../output/Bilan_Régional_Ecrevisses_files/figure-docx/unnamed-chunk-8-1.png" id="32" name="Picture"/>
+                    <pic:cNvPr descr="../output/Bilan_Régional_Ecrevisses_files/figure-docx/unnamed-chunk-7-1.png" id="32" name="Picture"/>
                     <pic:cNvPicPr>
                       <a:picLocks noChangeArrowheads="1" noChangeAspect="1"/>
                     </pic:cNvPicPr>
@@ -4806,7 +5331,175 @@
                 <w:szCs w:val="20"/>
                 <w:color w:val="000000"/>
               </w:rPr>
-              <w:t xml:space="preserve">85,66</w:t>
+              <w:t xml:space="preserve">81,47</w:t>
+            </w:r>
+          </w:p>
+        </w:tc>
+      </w:tr>
+      <w:tr>
+        <w:trPr>
+          <w:trHeight w:val="580" w:hRule="auto"/>
+        </w:trPr>
+        body2
+        <w:tc>
+          <w:tcPr>
+            <w:tcBorders>
+              <w:bottom w:val="single" w:sz="6" w:space="0" w:color="666666"/>
+              <w:top w:val="single" w:sz="6" w:space="0" w:color="666666"/>
+              <w:left w:val="none" w:sz="0" w:space="0" w:color="000000"/>
+              <w:right w:val="none" w:sz="0" w:space="0" w:color="000000"/>
+            </w:tcBorders>
+            <w:shd w:val="clear" w:color="auto" w:fill="FFFFFF"/>
+            <w:tcMar>
+              <w:top w:w="0" w:type="dxa"/>
+              <w:bottom w:w="0" w:type="dxa"/>
+              <w:left w:w="0" w:type="dxa"/>
+              <w:right w:w="0" w:type="dxa"/>
+            </w:tcMar>
+            <w:vAlign w:val="center"/>
+          </w:tcPr>
+          <w:p>
+            <w:pPr>
+              <w:jc w:val="center"/>
+              <w:pBdr>
+                <w:bottom w:val="none" w:sz="0" w:space="0" w:color="000000"/>
+                <w:top w:val="none" w:sz="0" w:space="0" w:color="000000"/>
+                <w:left w:val="none" w:sz="0" w:space="0" w:color="000000"/>
+                <w:right w:val="none" w:sz="0" w:space="0" w:color="000000"/>
+              </w:pBdr>
+              <w:spacing w:after="100" w:before="100" w:line="240"/>
+              <w:ind w:left="100" w:right="100" w:firstLine="0" w:firstLineChars="0"/>
+              <w:rPr>
+                <w:rFonts w:ascii="Arial" w:hAnsi="Arial" w:eastAsia="Arial" w:cs="Arial"/>
+                <w:i w:val="false"/>
+                <w:b w:val="false"/>
+                <w:u w:val="none"/>
+                <w:strike w:val="false"/>
+                <w:sz w:val="20"/>
+                <w:szCs w:val="20"/>
+                <w:color w:val="000000"/>
+              </w:rPr>
+            </w:pPr>
+            <w:r xmlns:w="http://schemas.openxmlformats.org/wordprocessingml/2006/main" xmlns:wp="http://schemas.openxmlformats.org/drawingml/2006/wordprocessingDrawing" xmlns:r="http://schemas.openxmlformats.org/officeDocument/2006/relationships" xmlns:w14="http://schemas.microsoft.com/office/word/2010/wordml">
+              <w:rPr>
+                <w:rFonts w:ascii="Arial" w:hAnsi="Arial" w:eastAsia="Arial" w:cs="Arial"/>
+                <w:i w:val="false"/>
+                <w:b w:val="false"/>
+                <w:u w:val="none"/>
+                <w:strike w:val="false"/>
+                <w:sz w:val="20"/>
+                <w:szCs w:val="20"/>
+                <w:color w:val="000000"/>
+              </w:rPr>
+              <w:t xml:space="preserve">Douteux</w:t>
+            </w:r>
+          </w:p>
+        </w:tc>
+        <w:tc>
+          <w:tcPr>
+            <w:tcBorders>
+              <w:bottom w:val="single" w:sz="6" w:space="0" w:color="666666"/>
+              <w:top w:val="single" w:sz="6" w:space="0" w:color="666666"/>
+              <w:left w:val="none" w:sz="0" w:space="0" w:color="000000"/>
+              <w:right w:val="none" w:sz="0" w:space="0" w:color="000000"/>
+            </w:tcBorders>
+            <w:shd w:val="clear" w:color="auto" w:fill="FFFFFF"/>
+            <w:tcMar>
+              <w:top w:w="0" w:type="dxa"/>
+              <w:bottom w:w="0" w:type="dxa"/>
+              <w:left w:w="0" w:type="dxa"/>
+              <w:right w:w="0" w:type="dxa"/>
+            </w:tcMar>
+            <w:vAlign w:val="center"/>
+          </w:tcPr>
+          <w:p>
+            <w:pPr>
+              <w:jc w:val="center"/>
+              <w:pBdr>
+                <w:bottom w:val="none" w:sz="0" w:space="0" w:color="000000"/>
+                <w:top w:val="none" w:sz="0" w:space="0" w:color="000000"/>
+                <w:left w:val="none" w:sz="0" w:space="0" w:color="000000"/>
+                <w:right w:val="none" w:sz="0" w:space="0" w:color="000000"/>
+              </w:pBdr>
+              <w:spacing w:after="100" w:before="100" w:line="240"/>
+              <w:ind w:left="100" w:right="100" w:firstLine="0" w:firstLineChars="0"/>
+              <w:rPr>
+                <w:rFonts w:ascii="Arial" w:hAnsi="Arial" w:eastAsia="Arial" w:cs="Arial"/>
+                <w:i w:val="false"/>
+                <w:b w:val="false"/>
+                <w:u w:val="none"/>
+                <w:strike w:val="false"/>
+                <w:sz w:val="20"/>
+                <w:szCs w:val="20"/>
+                <w:color w:val="000000"/>
+              </w:rPr>
+            </w:pPr>
+            <w:r xmlns:w="http://schemas.openxmlformats.org/wordprocessingml/2006/main" xmlns:wp="http://schemas.openxmlformats.org/drawingml/2006/wordprocessingDrawing" xmlns:r="http://schemas.openxmlformats.org/officeDocument/2006/relationships" xmlns:w14="http://schemas.microsoft.com/office/word/2010/wordml">
+              <w:rPr>
+                <w:rFonts w:ascii="Arial" w:hAnsi="Arial" w:eastAsia="Arial" w:cs="Arial"/>
+                <w:i w:val="false"/>
+                <w:b w:val="false"/>
+                <w:u w:val="none"/>
+                <w:strike w:val="false"/>
+                <w:sz w:val="20"/>
+                <w:szCs w:val="20"/>
+                <w:color w:val="000000"/>
+              </w:rPr>
+              <w:t xml:space="preserve">223</w:t>
+            </w:r>
+          </w:p>
+        </w:tc>
+        <w:tc>
+          <w:tcPr>
+            <w:tcBorders>
+              <w:bottom w:val="single" w:sz="6" w:space="0" w:color="666666"/>
+              <w:top w:val="single" w:sz="6" w:space="0" w:color="666666"/>
+              <w:left w:val="none" w:sz="0" w:space="0" w:color="000000"/>
+              <w:right w:val="none" w:sz="0" w:space="0" w:color="000000"/>
+            </w:tcBorders>
+            <w:shd w:val="clear" w:color="auto" w:fill="FFFFFF"/>
+            <w:tcMar>
+              <w:top w:w="0" w:type="dxa"/>
+              <w:bottom w:w="0" w:type="dxa"/>
+              <w:left w:w="0" w:type="dxa"/>
+              <w:right w:w="0" w:type="dxa"/>
+            </w:tcMar>
+            <w:vAlign w:val="center"/>
+          </w:tcPr>
+          <w:p>
+            <w:pPr>
+              <w:jc w:val="center"/>
+              <w:pBdr>
+                <w:bottom w:val="none" w:sz="0" w:space="0" w:color="000000"/>
+                <w:top w:val="none" w:sz="0" w:space="0" w:color="000000"/>
+                <w:left w:val="none" w:sz="0" w:space="0" w:color="000000"/>
+                <w:right w:val="none" w:sz="0" w:space="0" w:color="000000"/>
+              </w:pBdr>
+              <w:spacing w:after="100" w:before="100" w:line="240"/>
+              <w:ind w:left="100" w:right="100" w:firstLine="0" w:firstLineChars="0"/>
+              <w:rPr>
+                <w:rFonts w:ascii="Arial" w:hAnsi="Arial" w:eastAsia="Arial" w:cs="Arial"/>
+                <w:i w:val="false"/>
+                <w:b w:val="false"/>
+                <w:u w:val="none"/>
+                <w:strike w:val="false"/>
+                <w:sz w:val="20"/>
+                <w:szCs w:val="20"/>
+                <w:color w:val="000000"/>
+              </w:rPr>
+            </w:pPr>
+            <w:r xmlns:w="http://schemas.openxmlformats.org/wordprocessingml/2006/main" xmlns:wp="http://schemas.openxmlformats.org/drawingml/2006/wordprocessingDrawing" xmlns:r="http://schemas.openxmlformats.org/officeDocument/2006/relationships" xmlns:w14="http://schemas.microsoft.com/office/word/2010/wordml">
+              <w:rPr>
+                <w:rFonts w:ascii="Arial" w:hAnsi="Arial" w:eastAsia="Arial" w:cs="Arial"/>
+                <w:i w:val="false"/>
+                <w:b w:val="false"/>
+                <w:u w:val="none"/>
+                <w:strike w:val="false"/>
+                <w:sz w:val="20"/>
+                <w:szCs w:val="20"/>
+                <w:color w:val="000000"/>
+              </w:rPr>
+              <w:t xml:space="preserve">5,77</w:t>
             </w:r>
           </w:p>
         </w:tc>
@@ -4815,7 +5508,7 @@
         <w:trPr>
           <w:trHeight w:val="583" w:hRule="auto"/>
         </w:trPr>
-        body2
+        body3
         <w:tc>
           <w:tcPr>
             <w:tcBorders>
@@ -4866,7 +5559,7 @@
                 <w:szCs w:val="20"/>
                 <w:color w:val="000000"/>
               </w:rPr>
-              <w:t xml:space="preserve">Douteux</w:t>
+              <w:t xml:space="preserve">Non évaluée</w:t>
             </w:r>
           </w:p>
         </w:tc>
@@ -4920,7 +5613,7 @@
                 <w:szCs w:val="20"/>
                 <w:color w:val="000000"/>
               </w:rPr>
-              <w:t xml:space="preserve">223</w:t>
+              <w:t xml:space="preserve">211</w:t>
             </w:r>
           </w:p>
         </w:tc>
@@ -4974,175 +5667,7 @@
                 <w:szCs w:val="20"/>
                 <w:color w:val="000000"/>
               </w:rPr>
-              <w:t xml:space="preserve">6,07</w:t>
-            </w:r>
-          </w:p>
-        </w:tc>
-      </w:tr>
-      <w:tr>
-        <w:trPr>
-          <w:trHeight w:val="582" w:hRule="auto"/>
-        </w:trPr>
-        body3
-        <w:tc>
-          <w:tcPr>
-            <w:tcBorders>
-              <w:bottom w:val="single" w:sz="6" w:space="0" w:color="666666"/>
-              <w:top w:val="single" w:sz="6" w:space="0" w:color="666666"/>
-              <w:left w:val="none" w:sz="0" w:space="0" w:color="000000"/>
-              <w:right w:val="none" w:sz="0" w:space="0" w:color="000000"/>
-            </w:tcBorders>
-            <w:shd w:val="clear" w:color="auto" w:fill="FFFFFF"/>
-            <w:tcMar>
-              <w:top w:w="0" w:type="dxa"/>
-              <w:bottom w:w="0" w:type="dxa"/>
-              <w:left w:w="0" w:type="dxa"/>
-              <w:right w:w="0" w:type="dxa"/>
-            </w:tcMar>
-            <w:vAlign w:val="center"/>
-          </w:tcPr>
-          <w:p>
-            <w:pPr>
-              <w:jc w:val="center"/>
-              <w:pBdr>
-                <w:bottom w:val="none" w:sz="0" w:space="0" w:color="000000"/>
-                <w:top w:val="none" w:sz="0" w:space="0" w:color="000000"/>
-                <w:left w:val="none" w:sz="0" w:space="0" w:color="000000"/>
-                <w:right w:val="none" w:sz="0" w:space="0" w:color="000000"/>
-              </w:pBdr>
-              <w:spacing w:after="100" w:before="100" w:line="240"/>
-              <w:ind w:left="100" w:right="100" w:firstLine="0" w:firstLineChars="0"/>
-              <w:rPr>
-                <w:rFonts w:ascii="Arial" w:hAnsi="Arial" w:eastAsia="Arial" w:cs="Arial"/>
-                <w:i w:val="false"/>
-                <w:b w:val="false"/>
-                <w:u w:val="none"/>
-                <w:strike w:val="false"/>
-                <w:sz w:val="20"/>
-                <w:szCs w:val="20"/>
-                <w:color w:val="000000"/>
-              </w:rPr>
-            </w:pPr>
-            <w:r xmlns:w="http://schemas.openxmlformats.org/wordprocessingml/2006/main" xmlns:wp="http://schemas.openxmlformats.org/drawingml/2006/wordprocessingDrawing" xmlns:r="http://schemas.openxmlformats.org/officeDocument/2006/relationships" xmlns:w14="http://schemas.microsoft.com/office/word/2010/wordml">
-              <w:rPr>
-                <w:rFonts w:ascii="Arial" w:hAnsi="Arial" w:eastAsia="Arial" w:cs="Arial"/>
-                <w:i w:val="false"/>
-                <w:b w:val="false"/>
-                <w:u w:val="none"/>
-                <w:strike w:val="false"/>
-                <w:sz w:val="20"/>
-                <w:szCs w:val="20"/>
-                <w:color w:val="000000"/>
-              </w:rPr>
-              <w:t xml:space="preserve">Non évaluée</w:t>
-            </w:r>
-          </w:p>
-        </w:tc>
-        <w:tc>
-          <w:tcPr>
-            <w:tcBorders>
-              <w:bottom w:val="single" w:sz="6" w:space="0" w:color="666666"/>
-              <w:top w:val="single" w:sz="6" w:space="0" w:color="666666"/>
-              <w:left w:val="none" w:sz="0" w:space="0" w:color="000000"/>
-              <w:right w:val="none" w:sz="0" w:space="0" w:color="000000"/>
-            </w:tcBorders>
-            <w:shd w:val="clear" w:color="auto" w:fill="FFFFFF"/>
-            <w:tcMar>
-              <w:top w:w="0" w:type="dxa"/>
-              <w:bottom w:w="0" w:type="dxa"/>
-              <w:left w:w="0" w:type="dxa"/>
-              <w:right w:w="0" w:type="dxa"/>
-            </w:tcMar>
-            <w:vAlign w:val="center"/>
-          </w:tcPr>
-          <w:p>
-            <w:pPr>
-              <w:jc w:val="center"/>
-              <w:pBdr>
-                <w:bottom w:val="none" w:sz="0" w:space="0" w:color="000000"/>
-                <w:top w:val="none" w:sz="0" w:space="0" w:color="000000"/>
-                <w:left w:val="none" w:sz="0" w:space="0" w:color="000000"/>
-                <w:right w:val="none" w:sz="0" w:space="0" w:color="000000"/>
-              </w:pBdr>
-              <w:spacing w:after="100" w:before="100" w:line="240"/>
-              <w:ind w:left="100" w:right="100" w:firstLine="0" w:firstLineChars="0"/>
-              <w:rPr>
-                <w:rFonts w:ascii="Arial" w:hAnsi="Arial" w:eastAsia="Arial" w:cs="Arial"/>
-                <w:i w:val="false"/>
-                <w:b w:val="false"/>
-                <w:u w:val="none"/>
-                <w:strike w:val="false"/>
-                <w:sz w:val="20"/>
-                <w:szCs w:val="20"/>
-                <w:color w:val="000000"/>
-              </w:rPr>
-            </w:pPr>
-            <w:r xmlns:w="http://schemas.openxmlformats.org/wordprocessingml/2006/main" xmlns:wp="http://schemas.openxmlformats.org/drawingml/2006/wordprocessingDrawing" xmlns:r="http://schemas.openxmlformats.org/officeDocument/2006/relationships" xmlns:w14="http://schemas.microsoft.com/office/word/2010/wordml">
-              <w:rPr>
-                <w:rFonts w:ascii="Arial" w:hAnsi="Arial" w:eastAsia="Arial" w:cs="Arial"/>
-                <w:i w:val="false"/>
-                <w:b w:val="false"/>
-                <w:u w:val="none"/>
-                <w:strike w:val="false"/>
-                <w:sz w:val="20"/>
-                <w:szCs w:val="20"/>
-                <w:color w:val="000000"/>
-              </w:rPr>
-              <w:t xml:space="preserve">211</w:t>
-            </w:r>
-          </w:p>
-        </w:tc>
-        <w:tc>
-          <w:tcPr>
-            <w:tcBorders>
-              <w:bottom w:val="single" w:sz="6" w:space="0" w:color="666666"/>
-              <w:top w:val="single" w:sz="6" w:space="0" w:color="666666"/>
-              <w:left w:val="none" w:sz="0" w:space="0" w:color="000000"/>
-              <w:right w:val="none" w:sz="0" w:space="0" w:color="000000"/>
-            </w:tcBorders>
-            <w:shd w:val="clear" w:color="auto" w:fill="FFFFFF"/>
-            <w:tcMar>
-              <w:top w:w="0" w:type="dxa"/>
-              <w:bottom w:w="0" w:type="dxa"/>
-              <w:left w:w="0" w:type="dxa"/>
-              <w:right w:w="0" w:type="dxa"/>
-            </w:tcMar>
-            <w:vAlign w:val="center"/>
-          </w:tcPr>
-          <w:p>
-            <w:pPr>
-              <w:jc w:val="center"/>
-              <w:pBdr>
-                <w:bottom w:val="none" w:sz="0" w:space="0" w:color="000000"/>
-                <w:top w:val="none" w:sz="0" w:space="0" w:color="000000"/>
-                <w:left w:val="none" w:sz="0" w:space="0" w:color="000000"/>
-                <w:right w:val="none" w:sz="0" w:space="0" w:color="000000"/>
-              </w:pBdr>
-              <w:spacing w:after="100" w:before="100" w:line="240"/>
-              <w:ind w:left="100" w:right="100" w:firstLine="0" w:firstLineChars="0"/>
-              <w:rPr>
-                <w:rFonts w:ascii="Arial" w:hAnsi="Arial" w:eastAsia="Arial" w:cs="Arial"/>
-                <w:i w:val="false"/>
-                <w:b w:val="false"/>
-                <w:u w:val="none"/>
-                <w:strike w:val="false"/>
-                <w:sz w:val="20"/>
-                <w:szCs w:val="20"/>
-                <w:color w:val="000000"/>
-              </w:rPr>
-            </w:pPr>
-            <w:r xmlns:w="http://schemas.openxmlformats.org/wordprocessingml/2006/main" xmlns:wp="http://schemas.openxmlformats.org/drawingml/2006/wordprocessingDrawing" xmlns:r="http://schemas.openxmlformats.org/officeDocument/2006/relationships" xmlns:w14="http://schemas.microsoft.com/office/word/2010/wordml">
-              <w:rPr>
-                <w:rFonts w:ascii="Arial" w:hAnsi="Arial" w:eastAsia="Arial" w:cs="Arial"/>
-                <w:i w:val="false"/>
-                <w:b w:val="false"/>
-                <w:u w:val="none"/>
-                <w:strike w:val="false"/>
-                <w:sz w:val="20"/>
-                <w:szCs w:val="20"/>
-                <w:color w:val="000000"/>
-              </w:rPr>
-              <w:t xml:space="preserve">5,74</w:t>
+              <w:t xml:space="preserve">5,46</w:t>
             </w:r>
           </w:p>
         </w:tc>
@@ -5202,7 +5727,7 @@
                 <w:szCs w:val="20"/>
                 <w:color w:val="000000"/>
               </w:rPr>
-              <w:t xml:space="preserve">En cours d'évaluation</w:t>
+              <w:t xml:space="preserve">Valide</w:t>
             </w:r>
           </w:p>
         </w:tc>
@@ -5256,7 +5781,7 @@
                 <w:szCs w:val="20"/>
                 <w:color w:val="000000"/>
               </w:rPr>
-              <w:t xml:space="preserve">87</w:t>
+              <w:t xml:space="preserve">189</w:t>
             </w:r>
           </w:p>
         </w:tc>
@@ -5310,7 +5835,175 @@
                 <w:szCs w:val="20"/>
                 <w:color w:val="000000"/>
               </w:rPr>
-              <w:t xml:space="preserve">2,37</w:t>
+              <w:t xml:space="preserve">4,89</w:t>
+            </w:r>
+          </w:p>
+        </w:tc>
+      </w:tr>
+      <w:tr>
+        <w:trPr>
+          <w:trHeight w:val="583" w:hRule="auto"/>
+        </w:trPr>
+        body5
+        <w:tc>
+          <w:tcPr>
+            <w:tcBorders>
+              <w:bottom w:val="single" w:sz="6" w:space="0" w:color="666666"/>
+              <w:top w:val="single" w:sz="6" w:space="0" w:color="666666"/>
+              <w:left w:val="none" w:sz="0" w:space="0" w:color="000000"/>
+              <w:right w:val="none" w:sz="0" w:space="0" w:color="000000"/>
+            </w:tcBorders>
+            <w:shd w:val="clear" w:color="auto" w:fill="FFFFFF"/>
+            <w:tcMar>
+              <w:top w:w="0" w:type="dxa"/>
+              <w:bottom w:w="0" w:type="dxa"/>
+              <w:left w:w="0" w:type="dxa"/>
+              <w:right w:w="0" w:type="dxa"/>
+            </w:tcMar>
+            <w:vAlign w:val="center"/>
+          </w:tcPr>
+          <w:p>
+            <w:pPr>
+              <w:jc w:val="center"/>
+              <w:pBdr>
+                <w:bottom w:val="none" w:sz="0" w:space="0" w:color="000000"/>
+                <w:top w:val="none" w:sz="0" w:space="0" w:color="000000"/>
+                <w:left w:val="none" w:sz="0" w:space="0" w:color="000000"/>
+                <w:right w:val="none" w:sz="0" w:space="0" w:color="000000"/>
+              </w:pBdr>
+              <w:spacing w:after="100" w:before="100" w:line="240"/>
+              <w:ind w:left="100" w:right="100" w:firstLine="0" w:firstLineChars="0"/>
+              <w:rPr>
+                <w:rFonts w:ascii="Arial" w:hAnsi="Arial" w:eastAsia="Arial" w:cs="Arial"/>
+                <w:i w:val="false"/>
+                <w:b w:val="false"/>
+                <w:u w:val="none"/>
+                <w:strike w:val="false"/>
+                <w:sz w:val="20"/>
+                <w:szCs w:val="20"/>
+                <w:color w:val="000000"/>
+              </w:rPr>
+            </w:pPr>
+            <w:r xmlns:w="http://schemas.openxmlformats.org/wordprocessingml/2006/main" xmlns:wp="http://schemas.openxmlformats.org/drawingml/2006/wordprocessingDrawing" xmlns:r="http://schemas.openxmlformats.org/officeDocument/2006/relationships" xmlns:w14="http://schemas.microsoft.com/office/word/2010/wordml">
+              <w:rPr>
+                <w:rFonts w:ascii="Arial" w:hAnsi="Arial" w:eastAsia="Arial" w:cs="Arial"/>
+                <w:i w:val="false"/>
+                <w:b w:val="false"/>
+                <w:u w:val="none"/>
+                <w:strike w:val="false"/>
+                <w:sz w:val="20"/>
+                <w:szCs w:val="20"/>
+                <w:color w:val="000000"/>
+              </w:rPr>
+              <w:t xml:space="preserve">En cours d'évaluation</w:t>
+            </w:r>
+          </w:p>
+        </w:tc>
+        <w:tc>
+          <w:tcPr>
+            <w:tcBorders>
+              <w:bottom w:val="single" w:sz="6" w:space="0" w:color="666666"/>
+              <w:top w:val="single" w:sz="6" w:space="0" w:color="666666"/>
+              <w:left w:val="none" w:sz="0" w:space="0" w:color="000000"/>
+              <w:right w:val="none" w:sz="0" w:space="0" w:color="000000"/>
+            </w:tcBorders>
+            <w:shd w:val="clear" w:color="auto" w:fill="FFFFFF"/>
+            <w:tcMar>
+              <w:top w:w="0" w:type="dxa"/>
+              <w:bottom w:w="0" w:type="dxa"/>
+              <w:left w:w="0" w:type="dxa"/>
+              <w:right w:w="0" w:type="dxa"/>
+            </w:tcMar>
+            <w:vAlign w:val="center"/>
+          </w:tcPr>
+          <w:p>
+            <w:pPr>
+              <w:jc w:val="center"/>
+              <w:pBdr>
+                <w:bottom w:val="none" w:sz="0" w:space="0" w:color="000000"/>
+                <w:top w:val="none" w:sz="0" w:space="0" w:color="000000"/>
+                <w:left w:val="none" w:sz="0" w:space="0" w:color="000000"/>
+                <w:right w:val="none" w:sz="0" w:space="0" w:color="000000"/>
+              </w:pBdr>
+              <w:spacing w:after="100" w:before="100" w:line="240"/>
+              <w:ind w:left="100" w:right="100" w:firstLine="0" w:firstLineChars="0"/>
+              <w:rPr>
+                <w:rFonts w:ascii="Arial" w:hAnsi="Arial" w:eastAsia="Arial" w:cs="Arial"/>
+                <w:i w:val="false"/>
+                <w:b w:val="false"/>
+                <w:u w:val="none"/>
+                <w:strike w:val="false"/>
+                <w:sz w:val="20"/>
+                <w:szCs w:val="20"/>
+                <w:color w:val="000000"/>
+              </w:rPr>
+            </w:pPr>
+            <w:r xmlns:w="http://schemas.openxmlformats.org/wordprocessingml/2006/main" xmlns:wp="http://schemas.openxmlformats.org/drawingml/2006/wordprocessingDrawing" xmlns:r="http://schemas.openxmlformats.org/officeDocument/2006/relationships" xmlns:w14="http://schemas.microsoft.com/office/word/2010/wordml">
+              <w:rPr>
+                <w:rFonts w:ascii="Arial" w:hAnsi="Arial" w:eastAsia="Arial" w:cs="Arial"/>
+                <w:i w:val="false"/>
+                <w:b w:val="false"/>
+                <w:u w:val="none"/>
+                <w:strike w:val="false"/>
+                <w:sz w:val="20"/>
+                <w:szCs w:val="20"/>
+                <w:color w:val="000000"/>
+              </w:rPr>
+              <w:t xml:space="preserve">87</w:t>
+            </w:r>
+          </w:p>
+        </w:tc>
+        <w:tc>
+          <w:tcPr>
+            <w:tcBorders>
+              <w:bottom w:val="single" w:sz="6" w:space="0" w:color="666666"/>
+              <w:top w:val="single" w:sz="6" w:space="0" w:color="666666"/>
+              <w:left w:val="none" w:sz="0" w:space="0" w:color="000000"/>
+              <w:right w:val="none" w:sz="0" w:space="0" w:color="000000"/>
+            </w:tcBorders>
+            <w:shd w:val="clear" w:color="auto" w:fill="FFFFFF"/>
+            <w:tcMar>
+              <w:top w:w="0" w:type="dxa"/>
+              <w:bottom w:w="0" w:type="dxa"/>
+              <w:left w:w="0" w:type="dxa"/>
+              <w:right w:w="0" w:type="dxa"/>
+            </w:tcMar>
+            <w:vAlign w:val="center"/>
+          </w:tcPr>
+          <w:p>
+            <w:pPr>
+              <w:jc w:val="center"/>
+              <w:pBdr>
+                <w:bottom w:val="none" w:sz="0" w:space="0" w:color="000000"/>
+                <w:top w:val="none" w:sz="0" w:space="0" w:color="000000"/>
+                <w:left w:val="none" w:sz="0" w:space="0" w:color="000000"/>
+                <w:right w:val="none" w:sz="0" w:space="0" w:color="000000"/>
+              </w:pBdr>
+              <w:spacing w:after="100" w:before="100" w:line="240"/>
+              <w:ind w:left="100" w:right="100" w:firstLine="0" w:firstLineChars="0"/>
+              <w:rPr>
+                <w:rFonts w:ascii="Arial" w:hAnsi="Arial" w:eastAsia="Arial" w:cs="Arial"/>
+                <w:i w:val="false"/>
+                <w:b w:val="false"/>
+                <w:u w:val="none"/>
+                <w:strike w:val="false"/>
+                <w:sz w:val="20"/>
+                <w:szCs w:val="20"/>
+                <w:color w:val="000000"/>
+              </w:rPr>
+            </w:pPr>
+            <w:r xmlns:w="http://schemas.openxmlformats.org/wordprocessingml/2006/main" xmlns:wp="http://schemas.openxmlformats.org/drawingml/2006/wordprocessingDrawing" xmlns:r="http://schemas.openxmlformats.org/officeDocument/2006/relationships" xmlns:w14="http://schemas.microsoft.com/office/word/2010/wordml">
+              <w:rPr>
+                <w:rFonts w:ascii="Arial" w:hAnsi="Arial" w:eastAsia="Arial" w:cs="Arial"/>
+                <w:i w:val="false"/>
+                <w:b w:val="false"/>
+                <w:u w:val="none"/>
+                <w:strike w:val="false"/>
+                <w:sz w:val="20"/>
+                <w:szCs w:val="20"/>
+                <w:color w:val="000000"/>
+              </w:rPr>
+              <w:t xml:space="preserve">2,25</w:t>
             </w:r>
           </w:p>
         </w:tc>
@@ -5319,7 +6012,7 @@
         <w:trPr>
           <w:trHeight w:val="594" w:hRule="auto"/>
         </w:trPr>
-        body5
+        body6
         <w:tc>
           <w:tcPr>
             <w:tcBorders>
@@ -5824,7 +6517,7 @@
                 <w:szCs w:val="20"/>
                 <w:color w:val="000000"/>
               </w:rPr>
-              <w:t xml:space="preserve">2 464</w:t>
+              <w:t xml:space="preserve">2 583</w:t>
             </w:r>
           </w:p>
         </w:tc>
@@ -5878,7 +6571,7 @@
                 <w:szCs w:val="20"/>
                 <w:color w:val="000000"/>
               </w:rPr>
-              <w:t xml:space="preserve">67,07</w:t>
+              <w:t xml:space="preserve">66,87</w:t>
             </w:r>
           </w:p>
         </w:tc>
@@ -5992,7 +6685,7 @@
                 <w:szCs w:val="20"/>
                 <w:color w:val="000000"/>
               </w:rPr>
-              <w:t xml:space="preserve">1 203</w:t>
+              <w:t xml:space="preserve">1 273</w:t>
             </w:r>
           </w:p>
         </w:tc>
@@ -6046,7 +6739,7 @@
                 <w:szCs w:val="20"/>
                 <w:color w:val="000000"/>
               </w:rPr>
-              <w:t xml:space="preserve">32,74</w:t>
+              <w:t xml:space="preserve">32,95</w:t>
             </w:r>
           </w:p>
         </w:tc>
@@ -6214,7 +6907,7 @@
                 <w:szCs w:val="20"/>
                 <w:color w:val="000000"/>
               </w:rPr>
-              <w:t xml:space="preserve">0,19</w:t>
+              <w:t xml:space="preserve">0,18</w:t>
             </w:r>
           </w:p>
         </w:tc>
@@ -6282,6 +6975,7 @@
         <w:gridCol w:w="2612"/>
         <w:gridCol w:w="1878"/>
         <w:gridCol w:w="2306"/>
+        <w:gridCol w:w="2306"/>
         <w:gridCol w:w="1878"/>
       </w:tblGrid>
       <w:tr>
@@ -6580,7 +7274,87 @@
                 <w:szCs w:val="22"/>
                 <w:color w:val="FFFFFF"/>
               </w:rPr>
-              <w:t xml:space="preserve">après 2015</w:t>
+              <w:t xml:space="preserve">entre 2015 et 2020</w:t>
+            </w:r>
+          </w:p>
+        </w:tc>
+        <w:tc>
+          <w:tcPr>
+            <w:tcBorders>
+              <w:bottom w:val="single" w:sz="12" w:space="0" w:color="666666"/>
+              <w:top w:val="single" w:sz="12" w:space="0" w:color="666666"/>
+              <w:left w:val="none" w:sz="0" w:space="0" w:color="000000"/>
+              <w:right w:val="none" w:sz="0" w:space="0" w:color="000000"/>
+            </w:tcBorders>
+            <w:shd w:val="clear" w:color="auto" w:fill="333333"/>
+            <w:tcMar>
+              <w:top w:w="0" w:type="dxa"/>
+              <w:bottom w:w="0" w:type="dxa"/>
+              <w:left w:w="0" w:type="dxa"/>
+              <w:right w:w="0" w:type="dxa"/>
+            </w:tcMar>
+            <w:vAlign w:val="center"/>
+          </w:tcPr>
+          <w:p>
+            <w:pPr>
+              <w:jc w:val="center"/>
+              <w:pBdr>
+                <w:bottom w:val="none" w:sz="0" w:space="0" w:color="000000"/>
+                <w:top w:val="none" w:sz="0" w:space="0" w:color="000000"/>
+                <w:left w:val="none" w:sz="0" w:space="0" w:color="000000"/>
+                <w:right w:val="none" w:sz="0" w:space="0" w:color="000000"/>
+              </w:pBdr>
+              <w:spacing w:after="100" w:before="100" w:line="240"/>
+              <w:ind w:left="100" w:right="100" w:firstLine="0" w:firstLineChars="0"/>
+              <w:rPr>
+                <w:rFonts w:ascii="Arial" w:hAnsi="Arial" w:eastAsia="Arial" w:cs="Arial"/>
+                <w:i w:val="false"/>
+                <w:b w:val="true"/>
+                <w:u w:val="none"/>
+                <w:strike w:val="false"/>
+                <w:sz w:val="22"/>
+                <w:szCs w:val="22"/>
+                <w:color w:val="FFFFFF"/>
+              </w:rPr>
+            </w:pPr>
+            <w:r xmlns:w="http://schemas.openxmlformats.org/wordprocessingml/2006/main" xmlns:wp="http://schemas.openxmlformats.org/drawingml/2006/wordprocessingDrawing" xmlns:r="http://schemas.openxmlformats.org/officeDocument/2006/relationships" xmlns:w14="http://schemas.microsoft.com/office/word/2010/wordml">
+              <w:rPr>
+                <w:rFonts w:ascii="Arial" w:hAnsi="Arial" w:eastAsia="Arial" w:cs="Arial"/>
+                <w:i w:val="false"/>
+                <w:b w:val="true"/>
+                <w:u w:val="none"/>
+                <w:strike w:val="false"/>
+                <w:sz w:val="22"/>
+                <w:szCs w:val="22"/>
+                <w:color w:val="FFFFFF"/>
+              </w:rPr>
+              <w:t xml:space="preserve">Observations </w:t>
+            </w:r>
+            <w:r xmlns:w="http://schemas.openxmlformats.org/wordprocessingml/2006/main" xmlns:wp="http://schemas.openxmlformats.org/drawingml/2006/wordprocessingDrawing" xmlns:r="http://schemas.openxmlformats.org/officeDocument/2006/relationships" xmlns:w14="http://schemas.microsoft.com/office/word/2010/wordml">
+              <w:rPr>
+                <w:rFonts w:ascii="Arial" w:hAnsi="Arial" w:eastAsia="Arial" w:cs="Arial"/>
+                <w:i w:val="false"/>
+                <w:b w:val="true"/>
+                <w:u w:val="none"/>
+                <w:strike w:val="false"/>
+                <w:sz w:val="22"/>
+                <w:szCs w:val="22"/>
+                <w:color w:val="FFFFFF"/>
+              </w:rPr>
+              <w:br/>
+            </w:r>
+            <w:r xmlns:w="http://schemas.openxmlformats.org/wordprocessingml/2006/main" xmlns:wp="http://schemas.openxmlformats.org/drawingml/2006/wordprocessingDrawing" xmlns:r="http://schemas.openxmlformats.org/officeDocument/2006/relationships" xmlns:w14="http://schemas.microsoft.com/office/word/2010/wordml">
+              <w:rPr>
+                <w:rFonts w:ascii="Arial" w:hAnsi="Arial" w:eastAsia="Arial" w:cs="Arial"/>
+                <w:i w:val="false"/>
+                <w:b w:val="true"/>
+                <w:u w:val="none"/>
+                <w:strike w:val="false"/>
+                <w:sz w:val="22"/>
+                <w:szCs w:val="22"/>
+                <w:color w:val="FFFFFF"/>
+              </w:rPr>
+              <w:t xml:space="preserve">après 2020</w:t>
             </w:r>
           </w:p>
         </w:tc>
@@ -6802,7 +7576,61 @@
                 <w:szCs w:val="20"/>
                 <w:color w:val="000000"/>
               </w:rPr>
-              <w:t xml:space="preserve">20</w:t>
+              <w:t xml:space="preserve">10</w:t>
+            </w:r>
+          </w:p>
+        </w:tc>
+        <w:tc>
+          <w:tcPr>
+            <w:tcBorders>
+              <w:bottom w:val="single" w:sz="6" w:space="0" w:color="666666"/>
+              <w:top w:val="single" w:sz="12" w:space="0" w:color="666666"/>
+              <w:left w:val="none" w:sz="0" w:space="0" w:color="000000"/>
+              <w:right w:val="none" w:sz="0" w:space="0" w:color="000000"/>
+            </w:tcBorders>
+            <w:shd w:val="clear" w:color="auto" w:fill="FFFFFF"/>
+            <w:tcMar>
+              <w:top w:w="0" w:type="dxa"/>
+              <w:bottom w:w="0" w:type="dxa"/>
+              <w:left w:w="0" w:type="dxa"/>
+              <w:right w:w="0" w:type="dxa"/>
+            </w:tcMar>
+            <w:vAlign w:val="center"/>
+          </w:tcPr>
+          <w:p>
+            <w:pPr>
+              <w:jc w:val="center"/>
+              <w:pBdr>
+                <w:bottom w:val="none" w:sz="0" w:space="0" w:color="000000"/>
+                <w:top w:val="none" w:sz="0" w:space="0" w:color="000000"/>
+                <w:left w:val="none" w:sz="0" w:space="0" w:color="000000"/>
+                <w:right w:val="none" w:sz="0" w:space="0" w:color="000000"/>
+              </w:pBdr>
+              <w:spacing w:after="100" w:before="100" w:line="240"/>
+              <w:ind w:left="100" w:right="100" w:firstLine="0" w:firstLineChars="0"/>
+              <w:rPr>
+                <w:rFonts w:ascii="Arial" w:hAnsi="Arial" w:eastAsia="Arial" w:cs="Arial"/>
+                <w:i w:val="false"/>
+                <w:b w:val="false"/>
+                <w:u w:val="none"/>
+                <w:strike w:val="false"/>
+                <w:sz w:val="20"/>
+                <w:szCs w:val="20"/>
+                <w:color w:val="000000"/>
+              </w:rPr>
+            </w:pPr>
+            <w:r xmlns:w="http://schemas.openxmlformats.org/wordprocessingml/2006/main" xmlns:wp="http://schemas.openxmlformats.org/drawingml/2006/wordprocessingDrawing" xmlns:r="http://schemas.openxmlformats.org/officeDocument/2006/relationships" xmlns:w14="http://schemas.microsoft.com/office/word/2010/wordml">
+              <w:rPr>
+                <w:rFonts w:ascii="Arial" w:hAnsi="Arial" w:eastAsia="Arial" w:cs="Arial"/>
+                <w:i w:val="false"/>
+                <w:b w:val="false"/>
+                <w:u w:val="none"/>
+                <w:strike w:val="false"/>
+                <w:sz w:val="20"/>
+                <w:szCs w:val="20"/>
+                <w:color w:val="000000"/>
+              </w:rPr>
+              <w:t xml:space="preserve">10</w:t>
             </w:r>
           </w:p>
         </w:tc>
@@ -6970,7 +7798,7 @@
                 <w:szCs w:val="20"/>
                 <w:color w:val="000000"/>
               </w:rPr>
-              <w:t xml:space="preserve">160</w:t>
+              <w:t xml:space="preserve">335</w:t>
             </w:r>
           </w:p>
         </w:tc>
@@ -7024,7 +7852,61 @@
                 <w:szCs w:val="20"/>
                 <w:color w:val="000000"/>
               </w:rPr>
-              <w:t xml:space="preserve">0</w:t>
+              <w:t xml:space="preserve">92</w:t>
+            </w:r>
+          </w:p>
+        </w:tc>
+        <w:tc>
+          <w:tcPr>
+            <w:tcBorders>
+              <w:bottom w:val="single" w:sz="6" w:space="0" w:color="666666"/>
+              <w:top w:val="single" w:sz="6" w:space="0" w:color="666666"/>
+              <w:left w:val="none" w:sz="0" w:space="0" w:color="000000"/>
+              <w:right w:val="none" w:sz="0" w:space="0" w:color="000000"/>
+            </w:tcBorders>
+            <w:shd w:val="clear" w:color="auto" w:fill="FFFFFF"/>
+            <w:tcMar>
+              <w:top w:w="0" w:type="dxa"/>
+              <w:bottom w:w="0" w:type="dxa"/>
+              <w:left w:w="0" w:type="dxa"/>
+              <w:right w:w="0" w:type="dxa"/>
+            </w:tcMar>
+            <w:vAlign w:val="center"/>
+          </w:tcPr>
+          <w:p>
+            <w:pPr>
+              <w:jc w:val="center"/>
+              <w:pBdr>
+                <w:bottom w:val="none" w:sz="0" w:space="0" w:color="000000"/>
+                <w:top w:val="none" w:sz="0" w:space="0" w:color="000000"/>
+                <w:left w:val="none" w:sz="0" w:space="0" w:color="000000"/>
+                <w:right w:val="none" w:sz="0" w:space="0" w:color="000000"/>
+              </w:pBdr>
+              <w:spacing w:after="100" w:before="100" w:line="240"/>
+              <w:ind w:left="100" w:right="100" w:firstLine="0" w:firstLineChars="0"/>
+              <w:rPr>
+                <w:rFonts w:ascii="Arial" w:hAnsi="Arial" w:eastAsia="Arial" w:cs="Arial"/>
+                <w:i w:val="false"/>
+                <w:b w:val="false"/>
+                <w:u w:val="none"/>
+                <w:strike w:val="false"/>
+                <w:sz w:val="20"/>
+                <w:szCs w:val="20"/>
+                <w:color w:val="000000"/>
+              </w:rPr>
+            </w:pPr>
+            <w:r xmlns:w="http://schemas.openxmlformats.org/wordprocessingml/2006/main" xmlns:wp="http://schemas.openxmlformats.org/drawingml/2006/wordprocessingDrawing" xmlns:r="http://schemas.openxmlformats.org/officeDocument/2006/relationships" xmlns:w14="http://schemas.microsoft.com/office/word/2010/wordml">
+              <w:rPr>
+                <w:rFonts w:ascii="Arial" w:hAnsi="Arial" w:eastAsia="Arial" w:cs="Arial"/>
+                <w:i w:val="false"/>
+                <w:b w:val="false"/>
+                <w:u w:val="none"/>
+                <w:strike w:val="false"/>
+                <w:sz w:val="20"/>
+                <w:szCs w:val="20"/>
+                <w:color w:val="000000"/>
+              </w:rPr>
+              <w:t xml:space="preserve">81</w:t>
             </w:r>
           </w:p>
         </w:tc>
@@ -7192,7 +8074,7 @@
                 <w:szCs w:val="20"/>
                 <w:color w:val="000000"/>
               </w:rPr>
-              <w:t xml:space="preserve">24</w:t>
+              <w:t xml:space="preserve">488</w:t>
             </w:r>
           </w:p>
         </w:tc>
@@ -7246,7 +8128,61 @@
                 <w:szCs w:val="20"/>
                 <w:color w:val="000000"/>
               </w:rPr>
-              <w:t xml:space="preserve">12</w:t>
+              <w:t xml:space="preserve">729</w:t>
+            </w:r>
+          </w:p>
+        </w:tc>
+        <w:tc>
+          <w:tcPr>
+            <w:tcBorders>
+              <w:bottom w:val="single" w:sz="6" w:space="0" w:color="666666"/>
+              <w:top w:val="single" w:sz="6" w:space="0" w:color="666666"/>
+              <w:left w:val="none" w:sz="0" w:space="0" w:color="000000"/>
+              <w:right w:val="none" w:sz="0" w:space="0" w:color="000000"/>
+            </w:tcBorders>
+            <w:shd w:val="clear" w:color="auto" w:fill="FFFFFF"/>
+            <w:tcMar>
+              <w:top w:w="0" w:type="dxa"/>
+              <w:bottom w:w="0" w:type="dxa"/>
+              <w:left w:w="0" w:type="dxa"/>
+              <w:right w:w="0" w:type="dxa"/>
+            </w:tcMar>
+            <w:vAlign w:val="center"/>
+          </w:tcPr>
+          <w:p>
+            <w:pPr>
+              <w:jc w:val="center"/>
+              <w:pBdr>
+                <w:bottom w:val="none" w:sz="0" w:space="0" w:color="000000"/>
+                <w:top w:val="none" w:sz="0" w:space="0" w:color="000000"/>
+                <w:left w:val="none" w:sz="0" w:space="0" w:color="000000"/>
+                <w:right w:val="none" w:sz="0" w:space="0" w:color="000000"/>
+              </w:pBdr>
+              <w:spacing w:after="100" w:before="100" w:line="240"/>
+              <w:ind w:left="100" w:right="100" w:firstLine="0" w:firstLineChars="0"/>
+              <w:rPr>
+                <w:rFonts w:ascii="Arial" w:hAnsi="Arial" w:eastAsia="Arial" w:cs="Arial"/>
+                <w:i w:val="false"/>
+                <w:b w:val="false"/>
+                <w:u w:val="none"/>
+                <w:strike w:val="false"/>
+                <w:sz w:val="20"/>
+                <w:szCs w:val="20"/>
+                <w:color w:val="000000"/>
+              </w:rPr>
+            </w:pPr>
+            <w:r xmlns:w="http://schemas.openxmlformats.org/wordprocessingml/2006/main" xmlns:wp="http://schemas.openxmlformats.org/drawingml/2006/wordprocessingDrawing" xmlns:r="http://schemas.openxmlformats.org/officeDocument/2006/relationships" xmlns:w14="http://schemas.microsoft.com/office/word/2010/wordml">
+              <w:rPr>
+                <w:rFonts w:ascii="Arial" w:hAnsi="Arial" w:eastAsia="Arial" w:cs="Arial"/>
+                <w:i w:val="false"/>
+                <w:b w:val="false"/>
+                <w:u w:val="none"/>
+                <w:strike w:val="false"/>
+                <w:sz w:val="20"/>
+                <w:szCs w:val="20"/>
+                <w:color w:val="000000"/>
+              </w:rPr>
+              <w:t xml:space="preserve">746</w:t>
             </w:r>
           </w:p>
         </w:tc>
@@ -7414,7 +8350,7 @@
                 <w:szCs w:val="20"/>
                 <w:color w:val="000000"/>
               </w:rPr>
-              <w:t xml:space="preserve">280</w:t>
+              <w:t xml:space="preserve">477</w:t>
             </w:r>
           </w:p>
         </w:tc>
@@ -7468,7 +8404,61 @@
                 <w:szCs w:val="20"/>
                 <w:color w:val="000000"/>
               </w:rPr>
-              <w:t xml:space="preserve">98</w:t>
+              <w:t xml:space="preserve">190</w:t>
+            </w:r>
+          </w:p>
+        </w:tc>
+        <w:tc>
+          <w:tcPr>
+            <w:tcBorders>
+              <w:bottom w:val="single" w:sz="12" w:space="0" w:color="666666"/>
+              <w:top w:val="single" w:sz="6" w:space="0" w:color="666666"/>
+              <w:left w:val="none" w:sz="0" w:space="0" w:color="000000"/>
+              <w:right w:val="none" w:sz="0" w:space="0" w:color="000000"/>
+            </w:tcBorders>
+            <w:shd w:val="clear" w:color="auto" w:fill="FFFFFF"/>
+            <w:tcMar>
+              <w:top w:w="0" w:type="dxa"/>
+              <w:bottom w:w="0" w:type="dxa"/>
+              <w:left w:w="0" w:type="dxa"/>
+              <w:right w:w="0" w:type="dxa"/>
+            </w:tcMar>
+            <w:vAlign w:val="center"/>
+          </w:tcPr>
+          <w:p>
+            <w:pPr>
+              <w:jc w:val="center"/>
+              <w:pBdr>
+                <w:bottom w:val="none" w:sz="0" w:space="0" w:color="000000"/>
+                <w:top w:val="none" w:sz="0" w:space="0" w:color="000000"/>
+                <w:left w:val="none" w:sz="0" w:space="0" w:color="000000"/>
+                <w:right w:val="none" w:sz="0" w:space="0" w:color="000000"/>
+              </w:pBdr>
+              <w:spacing w:after="100" w:before="100" w:line="240"/>
+              <w:ind w:left="100" w:right="100" w:firstLine="0" w:firstLineChars="0"/>
+              <w:rPr>
+                <w:rFonts w:ascii="Arial" w:hAnsi="Arial" w:eastAsia="Arial" w:cs="Arial"/>
+                <w:i w:val="false"/>
+                <w:b w:val="false"/>
+                <w:u w:val="none"/>
+                <w:strike w:val="false"/>
+                <w:sz w:val="20"/>
+                <w:szCs w:val="20"/>
+                <w:color w:val="000000"/>
+              </w:rPr>
+            </w:pPr>
+            <w:r xmlns:w="http://schemas.openxmlformats.org/wordprocessingml/2006/main" xmlns:wp="http://schemas.openxmlformats.org/drawingml/2006/wordprocessingDrawing" xmlns:r="http://schemas.openxmlformats.org/officeDocument/2006/relationships" xmlns:w14="http://schemas.microsoft.com/office/word/2010/wordml">
+              <w:rPr>
+                <w:rFonts w:ascii="Arial" w:hAnsi="Arial" w:eastAsia="Arial" w:cs="Arial"/>
+                <w:i w:val="false"/>
+                <w:b w:val="false"/>
+                <w:u w:val="none"/>
+                <w:strike w:val="false"/>
+                <w:sz w:val="20"/>
+                <w:szCs w:val="20"/>
+                <w:color w:val="000000"/>
+              </w:rPr>
+              <w:t xml:space="preserve">359</w:t>
             </w:r>
           </w:p>
         </w:tc>
@@ -7536,7 +8526,7 @@
               <a:graphicData uri="http://schemas.openxmlformats.org/drawingml/2006/picture">
                 <pic:pic>
                   <pic:nvPicPr>
-                    <pic:cNvPr descr="../output/Bilan_Régional_Ecrevisses_files/figure-docx/unnamed-chunk-15-1.png" id="39" name="Picture"/>
+                    <pic:cNvPr descr="../output/Bilan_Régional_Ecrevisses_files/figure-docx/unnamed-chunk-14-1.png" id="39" name="Picture"/>
                     <pic:cNvPicPr>
                       <a:picLocks noChangeArrowheads="1" noChangeAspect="1"/>
                     </pic:cNvPicPr>
@@ -7628,7 +8618,7 @@
               <a:graphicData uri="http://schemas.openxmlformats.org/drawingml/2006/picture">
                 <pic:pic>
                   <pic:nvPicPr>
-                    <pic:cNvPr descr="../output/Bilan_Régional_Ecrevisses_files/figure-docx/unnamed-chunk-21-1.png" id="43" name="Picture"/>
+                    <pic:cNvPr descr="../output/Bilan_Régional_Ecrevisses_files/figure-docx/unnamed-chunk-20-1.png" id="43" name="Picture"/>
                     <pic:cNvPicPr>
                       <a:picLocks noChangeArrowheads="1" noChangeAspect="1"/>
                     </pic:cNvPicPr>
@@ -7675,7 +8665,7 @@
               <a:graphicData uri="http://schemas.openxmlformats.org/drawingml/2006/picture">
                 <pic:pic>
                   <pic:nvPicPr>
-                    <pic:cNvPr descr="../output/Bilan_Régional_Ecrevisses_files/figure-docx/unnamed-chunk-22-1.png" id="46" name="Picture"/>
+                    <pic:cNvPr descr="../output/Bilan_Régional_Ecrevisses_files/figure-docx/unnamed-chunk-21-1.png" id="46" name="Picture"/>
                     <pic:cNvPicPr>
                       <a:picLocks noChangeArrowheads="1" noChangeAspect="1"/>
                     </pic:cNvPicPr>
@@ -8209,7 +9199,7 @@
                 <w:szCs w:val="20"/>
                 <w:color w:val="000000"/>
               </w:rPr>
-              <w:t xml:space="preserve">3 671</w:t>
+              <w:t xml:space="preserve">3 860</w:t>
             </w:r>
           </w:p>
         </w:tc>
@@ -8302,7 +9292,7 @@
         </w:numPr>
       </w:pPr>
       <w:r>
-        <w:t xml:space="preserve">Nombre moyen de saisies par département = 305.9</w:t>
+        <w:t xml:space="preserve">Nombre moyen de saisies par département = 321.7</w:t>
       </w:r>
     </w:p>
     <w:p>
@@ -8313,7 +9303,7 @@
         </w:numPr>
       </w:pPr>
       <w:r>
-        <w:t xml:space="preserve">Nombre médian de saisies par département = 210.5</w:t>
+        <w:t xml:space="preserve">Nombre médian de saisies par département = 232.5</w:t>
       </w:r>
     </w:p>
     <w:p>
@@ -8324,7 +9314,7 @@
         </w:numPr>
       </w:pPr>
       <w:r>
-        <w:t xml:space="preserve">Ecart-type du nombre de saisies par département = 224.1</w:t>
+        <w:t xml:space="preserve">Ecart-type du nombre de saisies par département = 226.9</w:t>
       </w:r>
     </w:p>
     <w:p>
@@ -8335,7 +9325,7 @@
         </w:numPr>
       </w:pPr>
       <w:r>
-        <w:t xml:space="preserve">L’écart interquartile = 184.2</w:t>
+        <w:t xml:space="preserve">L’écart interquartile = 191.2</w:t>
       </w:r>
     </w:p>
     <w:p>
@@ -8690,7 +9680,7 @@
                 <w:szCs w:val="20"/>
                 <w:color w:val="000000"/>
               </w:rPr>
-              <w:t xml:space="preserve">166</w:t>
+              <w:t xml:space="preserve">182</w:t>
             </w:r>
           </w:p>
         </w:tc>
@@ -8744,7 +9734,7 @@
                 <w:szCs w:val="20"/>
                 <w:color w:val="000000"/>
               </w:rPr>
-              <w:t xml:space="preserve">65</w:t>
+              <w:t xml:space="preserve">74</w:t>
             </w:r>
           </w:p>
         </w:tc>
@@ -8912,7 +9902,7 @@
                 <w:szCs w:val="20"/>
                 <w:color w:val="000000"/>
               </w:rPr>
-              <w:t xml:space="preserve">113</w:t>
+              <w:t xml:space="preserve">118</w:t>
             </w:r>
           </w:p>
         </w:tc>
@@ -8966,7 +9956,7 @@
                 <w:szCs w:val="20"/>
                 <w:color w:val="000000"/>
               </w:rPr>
-              <w:t xml:space="preserve">53</w:t>
+              <w:t xml:space="preserve">55</w:t>
             </w:r>
           </w:p>
         </w:tc>
@@ -9134,7 +10124,7 @@
                 <w:szCs w:val="20"/>
                 <w:color w:val="000000"/>
               </w:rPr>
-              <w:t xml:space="preserve">459</w:t>
+              <w:t xml:space="preserve">475</w:t>
             </w:r>
           </w:p>
         </w:tc>
@@ -9188,7 +10178,7 @@
                 <w:szCs w:val="20"/>
                 <w:color w:val="000000"/>
               </w:rPr>
-              <w:t xml:space="preserve">160</w:t>
+              <w:t xml:space="preserve">168</w:t>
             </w:r>
           </w:p>
         </w:tc>
@@ -9356,7 +10346,7 @@
                 <w:szCs w:val="20"/>
                 <w:color w:val="000000"/>
               </w:rPr>
-              <w:t xml:space="preserve">688</w:t>
+              <w:t xml:space="preserve">705</w:t>
             </w:r>
           </w:p>
         </w:tc>
@@ -9410,7 +10400,7 @@
                 <w:szCs w:val="20"/>
                 <w:color w:val="000000"/>
               </w:rPr>
-              <w:t xml:space="preserve">158</w:t>
+              <w:t xml:space="preserve">170</w:t>
             </w:r>
           </w:p>
         </w:tc>
@@ -9578,7 +10568,7 @@
                 <w:szCs w:val="20"/>
                 <w:color w:val="000000"/>
               </w:rPr>
-              <w:t xml:space="preserve">223</w:t>
+              <w:t xml:space="preserve">249</w:t>
             </w:r>
           </w:p>
         </w:tc>
@@ -9632,7 +10622,7 @@
                 <w:szCs w:val="20"/>
                 <w:color w:val="000000"/>
               </w:rPr>
-              <w:t xml:space="preserve">112</w:t>
+              <w:t xml:space="preserve">128</w:t>
             </w:r>
           </w:p>
         </w:tc>
@@ -9800,7 +10790,7 @@
                 <w:szCs w:val="20"/>
                 <w:color w:val="000000"/>
               </w:rPr>
-              <w:t xml:space="preserve">145</w:t>
+              <w:t xml:space="preserve">154</w:t>
             </w:r>
           </w:p>
         </w:tc>
@@ -9854,7 +10844,7 @@
                 <w:szCs w:val="20"/>
                 <w:color w:val="000000"/>
               </w:rPr>
-              <w:t xml:space="preserve">73</w:t>
+              <w:t xml:space="preserve">80</w:t>
             </w:r>
           </w:p>
         </w:tc>
@@ -10022,7 +11012,7 @@
                 <w:szCs w:val="20"/>
                 <w:color w:val="000000"/>
               </w:rPr>
-              <w:t xml:space="preserve">112</w:t>
+              <w:t xml:space="preserve">127</w:t>
             </w:r>
           </w:p>
         </w:tc>
@@ -10076,7 +11066,7 @@
                 <w:szCs w:val="20"/>
                 <w:color w:val="000000"/>
               </w:rPr>
-              <w:t xml:space="preserve">50</w:t>
+              <w:t xml:space="preserve">59</w:t>
             </w:r>
           </w:p>
         </w:tc>
@@ -10244,7 +11234,7 @@
                 <w:szCs w:val="20"/>
                 <w:color w:val="000000"/>
               </w:rPr>
-              <w:t xml:space="preserve">307</w:t>
+              <w:t xml:space="preserve">330</w:t>
             </w:r>
           </w:p>
         </w:tc>
@@ -10298,7 +11288,7 @@
                 <w:szCs w:val="20"/>
                 <w:color w:val="000000"/>
               </w:rPr>
-              <w:t xml:space="preserve">112</w:t>
+              <w:t xml:space="preserve">127</w:t>
             </w:r>
           </w:p>
         </w:tc>
@@ -10466,7 +11456,7 @@
                 <w:szCs w:val="20"/>
                 <w:color w:val="000000"/>
               </w:rPr>
-              <w:t xml:space="preserve">197</w:t>
+              <w:t xml:space="preserve">198</w:t>
             </w:r>
           </w:p>
         </w:tc>
@@ -10520,7 +11510,7 @@
                 <w:szCs w:val="20"/>
                 <w:color w:val="000000"/>
               </w:rPr>
-              <w:t xml:space="preserve">33</w:t>
+              <w:t xml:space="preserve">34</w:t>
             </w:r>
           </w:p>
         </w:tc>
@@ -10688,7 +11678,7 @@
                 <w:szCs w:val="20"/>
                 <w:color w:val="000000"/>
               </w:rPr>
-              <w:t xml:space="preserve">198</w:t>
+              <w:t xml:space="preserve">216</w:t>
             </w:r>
           </w:p>
         </w:tc>
@@ -10742,7 +11732,7 @@
                 <w:szCs w:val="20"/>
                 <w:color w:val="000000"/>
               </w:rPr>
-              <w:t xml:space="preserve">92</w:t>
+              <w:t xml:space="preserve">103</w:t>
             </w:r>
           </w:p>
         </w:tc>
@@ -10910,7 +11900,7 @@
                 <w:szCs w:val="20"/>
                 <w:color w:val="000000"/>
               </w:rPr>
-              <w:t xml:space="preserve">276</w:t>
+              <w:t xml:space="preserve">298</w:t>
             </w:r>
           </w:p>
         </w:tc>
@@ -10964,7 +11954,7 @@
                 <w:szCs w:val="20"/>
                 <w:color w:val="000000"/>
               </w:rPr>
-              <w:t xml:space="preserve">125</w:t>
+              <w:t xml:space="preserve">138</w:t>
             </w:r>
           </w:p>
         </w:tc>
@@ -11132,7 +12122,7 @@
                 <w:szCs w:val="20"/>
                 <w:color w:val="000000"/>
               </w:rPr>
-              <w:t xml:space="preserve">787</w:t>
+              <w:t xml:space="preserve">808</w:t>
             </w:r>
           </w:p>
         </w:tc>
@@ -11186,7 +12176,7 @@
                 <w:szCs w:val="20"/>
                 <w:color w:val="000000"/>
               </w:rPr>
-              <w:t xml:space="preserve">214</w:t>
+              <w:t xml:space="preserve">224</w:t>
             </w:r>
           </w:p>
         </w:tc>
@@ -11260,7 +12250,7 @@
               <a:graphicData uri="http://schemas.openxmlformats.org/drawingml/2006/picture">
                 <pic:pic>
                   <pic:nvPicPr>
-                    <pic:cNvPr descr="../output/Bilan_Régional_Ecrevisses_files/figure-docx/unnamed-chunk-26-1.png" id="52" name="Picture"/>
+                    <pic:cNvPr descr="../output/Bilan_Régional_Ecrevisses_files/figure-docx/unnamed-chunk-25-1.png" id="52" name="Picture"/>
                     <pic:cNvPicPr>
                       <a:picLocks noChangeArrowheads="1" noChangeAspect="1"/>
                     </pic:cNvPicPr>
@@ -11306,7 +12296,7 @@
         <w:pStyle w:val="Corpsdetexte"/>
       </w:pPr>
       <w:r>
-        <w:t xml:space="preserve">Pour ces données, l’indice de Gini du nombre de saisies par département est de 0.36 ce qui indique une inégalité modérée à forte de la répartition de la pression d’observation. Quelques départements concentrent une part importante des saisies, ce qui est cohérent avec les statistiques descriptives présentées ci-dessus (moyenne, médiane et écart-type).</w:t>
+        <w:t xml:space="preserve">Pour ces données, l’indice de Gini du nombre de saisies par département est de 0.35 ce qui indique une inégalité modérée à forte de la répartition de la pression d’observation. Quelques départements concentrent une part importante des saisies, ce qui est cohérent avec les statistiques descriptives présentées ci-dessus (moyenne, médiane et écart-type).</w:t>
       </w:r>
     </w:p>
     <w:p>

</xml_diff>